<commit_message>
Labb 1 del 3 klar omfg
</commit_message>
<xml_diff>
--- a/Dokumentation/kommandon.docx
+++ b/Dokumentation/kommandon.docx
@@ -17,6 +17,12 @@
           <w:lang w:val="sv-SE"/>
         </w:rPr>
         <w:t xml:space="preserve">Kommandon</w:t>
+      </w:r>
+      <w:r>
+        <w:rPr>
+          <w:highlight w:val="none"/>
+          <w:lang w:val="sv-SE"/>
+        </w:rPr>
       </w:r>
       <w:r>
         <w:rPr>
@@ -112,6 +118,12 @@
           <w:lang w:val="sv-SE"/>
         </w:rPr>
       </w:r>
+      <w:r>
+        <w:rPr>
+          <w:highlight w:val="none"/>
+          <w:lang w:val="sv-SE"/>
+        </w:rPr>
+      </w:r>
     </w:p>
     <w:p>
       <w:pPr>
@@ -199,7 +211,7 @@
       <w:r>
         <w:rPr>
           <w:highlight w:val="none"/>
-          <w:lang w:val="sv-SE"/>
+          <w:lang w:val="sv-SE" w:bidi="sv-SE"/>
         </w:rPr>
       </w:r>
       <w:r>
@@ -243,7 +255,7 @@
       <w:r>
         <w:rPr>
           <w:highlight w:val="none"/>
-          <w:lang w:val="sv-SE"/>
+          <w:lang w:val="sv-SE" w:bidi="sv-SE"/>
         </w:rPr>
       </w:r>
       <w:r>
@@ -332,8 +344,8 @@
       </w:r>
       <w:r>
         <w:rPr>
-          <w:rFonts w:ascii="Courier New" w:hAnsi="Courier New" w:eastAsia="Courier New" w:cs="Courier New"/>
-          <w:sz w:val="20"/>
+          <w:highlight w:val="none"/>
+          <w:lang w:val="sv-SE"/>
         </w:rPr>
       </w:r>
       <w:r>
@@ -374,8 +386,8 @@
       </w:r>
       <w:r>
         <w:rPr>
-          <w:rFonts w:ascii="Courier New" w:hAnsi="Courier New" w:eastAsia="Courier New" w:cs="Courier New"/>
-          <w:sz w:val="20"/>
+          <w:highlight w:val="none"/>
+          <w:lang w:val="sv-SE"/>
         </w:rPr>
       </w:r>
       <w:r>
@@ -423,9 +435,8 @@
       </w:r>
       <w:r>
         <w:rPr>
-          <w:rFonts w:ascii="Courier New" w:hAnsi="Courier New" w:eastAsia="Courier New" w:cs="Courier New"/>
-          <w:sz w:val="20"/>
-          <w:szCs w:val="20"/>
+          <w:highlight w:val="none"/>
+          <w:lang w:val="sv-SE"/>
         </w:rPr>
       </w:r>
       <w:r>
@@ -473,9 +484,8 @@
       </w:r>
       <w:r>
         <w:rPr>
-          <w:rFonts w:ascii="Courier New" w:hAnsi="Courier New" w:eastAsia="Courier New" w:cs="Courier New"/>
-          <w:sz w:val="20"/>
-          <w:szCs w:val="20"/>
+          <w:highlight w:val="none"/>
+          <w:lang w:val="sv-SE"/>
         </w:rPr>
       </w:r>
       <w:r>
@@ -767,9 +777,8 @@
       </w:r>
       <w:r>
         <w:rPr>
-          <w:rFonts w:ascii="Courier New" w:hAnsi="Courier New" w:eastAsia="Courier New" w:cs="Courier New"/>
-          <w:sz w:val="20"/>
-          <w:szCs w:val="20"/>
+          <w:highlight w:val="none"/>
+          <w:lang w:val="sv-SE"/>
         </w:rPr>
       </w:r>
       <w:r>
@@ -828,11 +837,393 @@
         <w:spacing/>
         <w:ind w:right="0" w:firstLine="0" w:left="0"/>
         <w:rPr>
+          <w:highlight w:val="none"/>
+          <w:lang w:val="sv-SE"/>
+        </w:rPr>
+      </w:pPr>
+      <w:r>
+        <w:rPr>
+          <w:highlight w:val="none"/>
+          <w:lang w:val="sv-SE"/>
+        </w:rPr>
+        <w:t xml:space="preserve">Registrera AI-loggning</w:t>
+      </w:r>
+      <w:r>
+        <w:rPr>
           <w:rFonts w:ascii="Courier New" w:hAnsi="Courier New" w:eastAsia="Courier New" w:cs="Courier New"/>
           <w:sz w:val="20"/>
           <w:szCs w:val="20"/>
         </w:rPr>
-      </w:pPr>
+      </w:r>
+      <w:r>
+        <w:rPr>
+          <w:highlight w:val="none"/>
+          <w:lang w:val="sv-SE"/>
+        </w:rPr>
+      </w:r>
+    </w:p>
+    <w:p>
+      <w:pPr>
+        <w:pBdr>
+          <w:top w:val="none" w:color="000000" w:sz="4" w:space="0"/>
+          <w:left w:val="none" w:color="000000" w:sz="4" w:space="0"/>
+          <w:bottom w:val="none" w:color="000000" w:sz="4" w:space="0"/>
+          <w:right w:val="none" w:color="000000" w:sz="4" w:space="0"/>
+        </w:pBdr>
+        <w:spacing/>
+        <w:ind w:right="0" w:firstLine="0" w:left="0"/>
+        <w:rPr>
+          <w:highlight w:val="none"/>
+          <w:lang w:val="sv-SE"/>
+        </w:rPr>
+      </w:pPr>
+      <w:r>
+        <w:rPr>
+          <w:highlight w:val="none"/>
+          <w:lang w:val="sv-SE"/>
+        </w:rPr>
+      </w:r>
+      <w:r>
+        <w:rPr>
+          <w:rFonts w:ascii="Courier New" w:hAnsi="Courier New" w:eastAsia="Courier New" w:cs="Courier New"/>
+          <w:color w:val="000000"/>
+          <w:sz w:val="20"/>
+          <w:highlight w:val="white"/>
+        </w:rPr>
+        <w:t xml:space="preserve">date </w:t>
+      </w:r>
+      <w:r>
+        <w:rPr>
+          <w:rFonts w:ascii="Courier New" w:hAnsi="Courier New" w:eastAsia="Courier New" w:cs="Courier New"/>
+          <w:color w:val="54ffff"/>
+          <w:sz w:val="20"/>
+          <w:highlight w:val="white"/>
+        </w:rPr>
+        <w:t xml:space="preserve">&amp;&amp;</w:t>
+      </w:r>
+      <w:r>
+        <w:rPr>
+          <w:rFonts w:ascii="Courier New" w:hAnsi="Courier New" w:eastAsia="Courier New" w:cs="Courier New"/>
+          <w:color w:val="000000"/>
+          <w:sz w:val="20"/>
+          <w:highlight w:val="white"/>
+        </w:rPr>
+        <w:t xml:space="preserve"> sudo </w:t>
+      </w:r>
+      <w:r>
+        <w:rPr>
+          <w:rFonts w:ascii="Courier New" w:hAnsi="Courier New" w:eastAsia="Courier New" w:cs="Courier New"/>
+          <w:color w:val="18b2b2"/>
+          <w:sz w:val="20"/>
+          <w:highlight w:val="white"/>
+        </w:rPr>
+        <w:t xml:space="preserve">python3</w:t>
+      </w:r>
+      <w:r>
+        <w:rPr>
+          <w:rFonts w:ascii="Courier New" w:hAnsi="Courier New" w:eastAsia="Courier New" w:cs="Courier New"/>
+          <w:color w:val="000000"/>
+          <w:sz w:val="20"/>
+          <w:highlight w:val="white"/>
+        </w:rPr>
+        <w:t xml:space="preserve"> </w:t>
+      </w:r>
+      <w:r>
+        <w:rPr>
+          <w:rFonts w:ascii="Courier New" w:hAnsi="Courier New" w:eastAsia="Courier New" w:cs="Courier New"/>
+          <w:color w:val="18b2b2"/>
+          <w:sz w:val="20"/>
+          <w:highlight w:val="white"/>
+        </w:rPr>
+        <w:t xml:space="preserve">-c</w:t>
+      </w:r>
+      <w:r>
+        <w:rPr>
+          <w:rFonts w:ascii="Courier New" w:hAnsi="Courier New" w:eastAsia="Courier New" w:cs="Courier New"/>
+          <w:color w:val="000000"/>
+          <w:sz w:val="20"/>
+          <w:highlight w:val="white"/>
+        </w:rPr>
+        <w:t xml:space="preserve"> </w:t>
+      </w:r>
+      <w:r>
+        <w:rPr>
+          <w:rFonts w:ascii="Courier New" w:hAnsi="Courier New" w:eastAsia="Courier New" w:cs="Courier New"/>
+          <w:color w:val="b26818"/>
+          <w:sz w:val="20"/>
+          <w:highlight w:val="white"/>
+        </w:rPr>
+        <w:t xml:space="preserve">"</w:t>
+      </w:r>
+      <w:r>
+        <w:rPr>
+          <w:rFonts w:ascii="Courier New" w:hAnsi="Courier New" w:eastAsia="Courier New" w:cs="Courier New"/>
+          <w:color w:val="000000"/>
+          <w:sz w:val="20"/>
+          <w:highlight w:val="white"/>
+        </w:rPr>
+        <w:t xml:space="preserve"> </w:t>
+        <w:br/>
+        <w:t xml:space="preserve">       </w:t>
+      </w:r>
+      <w:r>
+        <w:rPr>
+          <w:rFonts w:ascii="Courier New" w:hAnsi="Courier New" w:eastAsia="Courier New" w:cs="Courier New"/>
+          <w:color w:val="b26818"/>
+          <w:sz w:val="20"/>
+          <w:highlight w:val="white"/>
+        </w:rPr>
+        <w:t xml:space="preserve">import json</w:t>
+      </w:r>
+      <w:r>
+        <w:rPr>
+          <w:rFonts w:ascii="Courier New" w:hAnsi="Courier New" w:eastAsia="Courier New" w:cs="Courier New"/>
+          <w:color w:val="000000"/>
+          <w:sz w:val="20"/>
+          <w:highlight w:val="white"/>
+        </w:rPr>
+        <w:t xml:space="preserve"> </w:t>
+        <w:br/>
+        <w:t xml:space="preserve">       </w:t>
+      </w:r>
+      <w:r>
+        <w:rPr>
+          <w:rFonts w:ascii="Courier New" w:hAnsi="Courier New" w:eastAsia="Courier New" w:cs="Courier New"/>
+          <w:color w:val="b26818"/>
+          <w:sz w:val="20"/>
+          <w:highlight w:val="white"/>
+        </w:rPr>
+        <w:t xml:space="preserve">import datetime</w:t>
+      </w:r>
+      <w:r>
+        <w:rPr>
+          <w:rFonts w:ascii="Courier New" w:hAnsi="Courier New" w:eastAsia="Courier New" w:cs="Courier New"/>
+          <w:color w:val="000000"/>
+          <w:sz w:val="20"/>
+          <w:highlight w:val="white"/>
+        </w:rPr>
+        <w:t xml:space="preserve"> </w:t>
+        <w:br/>
+        <w:t xml:space="preserve">       </w:t>
+      </w:r>
+      <w:r>
+        <w:rPr>
+          <w:rFonts w:ascii="Courier New" w:hAnsi="Courier New" w:eastAsia="Courier New" w:cs="Courier New"/>
+          <w:color w:val="b26818"/>
+          <w:sz w:val="20"/>
+          <w:highlight w:val="white"/>
+        </w:rPr>
+        <w:t xml:space="preserve">log_path = '/var/log/ai-anomaly-detector.log'</w:t>
+      </w:r>
+      <w:r>
+        <w:rPr>
+          <w:rFonts w:ascii="Courier New" w:hAnsi="Courier New" w:eastAsia="Courier New" w:cs="Courier New"/>
+          <w:color w:val="000000"/>
+          <w:sz w:val="20"/>
+          <w:highlight w:val="white"/>
+        </w:rPr>
+        <w:t xml:space="preserve"> </w:t>
+        <w:br/>
+        <w:t xml:space="preserve">       </w:t>
+      </w:r>
+      <w:r>
+        <w:rPr>
+          <w:rFonts w:ascii="Courier New" w:hAnsi="Courier New" w:eastAsia="Courier New" w:cs="Courier New"/>
+          <w:color w:val="b26818"/>
+          <w:sz w:val="20"/>
+          <w:highlight w:val="white"/>
+        </w:rPr>
+        <w:t xml:space="preserve">entry = {</w:t>
+      </w:r>
+      <w:r>
+        <w:rPr>
+          <w:rFonts w:ascii="Courier New" w:hAnsi="Courier New" w:eastAsia="Courier New" w:cs="Courier New"/>
+          <w:color w:val="000000"/>
+          <w:sz w:val="20"/>
+          <w:highlight w:val="white"/>
+        </w:rPr>
+        <w:t xml:space="preserve"> </w:t>
+        <w:br/>
+        <w:t xml:space="preserve">       </w:t>
+      </w:r>
+      <w:r>
+        <w:rPr>
+          <w:rFonts w:ascii="Courier New" w:hAnsi="Courier New" w:eastAsia="Courier New" w:cs="Courier New"/>
+          <w:color w:val="b26818"/>
+          <w:sz w:val="20"/>
+          <w:highlight w:val="white"/>
+        </w:rPr>
+        <w:t xml:space="preserve">    'ai_detector': True, </w:t>
+      </w:r>
+      <w:r>
+        <w:rPr>
+          <w:rFonts w:ascii="Courier New" w:hAnsi="Courier New" w:eastAsia="Courier New" w:cs="Courier New"/>
+          <w:color w:val="000000"/>
+          <w:sz w:val="20"/>
+          <w:highlight w:val="white"/>
+        </w:rPr>
+        <w:t xml:space="preserve"> </w:t>
+        <w:br/>
+        <w:t xml:space="preserve">       </w:t>
+      </w:r>
+      <w:r>
+        <w:rPr>
+          <w:rFonts w:ascii="Courier New" w:hAnsi="Courier New" w:eastAsia="Courier New" w:cs="Courier New"/>
+          <w:color w:val="b26818"/>
+          <w:sz w:val="20"/>
+          <w:highlight w:val="white"/>
+        </w:rPr>
+        <w:t xml:space="preserve">    'severity': 'critical', </w:t>
+      </w:r>
+      <w:r>
+        <w:rPr>
+          <w:rFonts w:ascii="Courier New" w:hAnsi="Courier New" w:eastAsia="Courier New" w:cs="Courier New"/>
+          <w:color w:val="000000"/>
+          <w:sz w:val="20"/>
+          <w:highlight w:val="white"/>
+        </w:rPr>
+        <w:t xml:space="preserve"> </w:t>
+        <w:br/>
+        <w:t xml:space="preserve">       </w:t>
+      </w:r>
+      <w:r>
+        <w:rPr>
+          <w:rFonts w:ascii="Courier New" w:hAnsi="Courier New" w:eastAsia="Courier New" w:cs="Courier New"/>
+          <w:color w:val="b26818"/>
+          <w:sz w:val="20"/>
+          <w:highlight w:val="white"/>
+        </w:rPr>
+        <w:t xml:space="preserve">    'message': 'MANUELL_MÄTNING_STARTAD: ' + str(datetime.datetime.now())</w:t>
+      </w:r>
+      <w:r>
+        <w:rPr>
+          <w:rFonts w:ascii="Courier New" w:hAnsi="Courier New" w:eastAsia="Courier New" w:cs="Courier New"/>
+          <w:color w:val="000000"/>
+          <w:sz w:val="20"/>
+          <w:highlight w:val="white"/>
+        </w:rPr>
+        <w:t xml:space="preserve"> </w:t>
+        <w:br/>
+        <w:t xml:space="preserve">       </w:t>
+      </w:r>
+      <w:r>
+        <w:rPr>
+          <w:rFonts w:ascii="Courier New" w:hAnsi="Courier New" w:eastAsia="Courier New" w:cs="Courier New"/>
+          <w:color w:val="b26818"/>
+          <w:sz w:val="20"/>
+          <w:highlight w:val="white"/>
+        </w:rPr>
+        <w:t xml:space="preserve">}</w:t>
+      </w:r>
+      <w:r>
+        <w:rPr>
+          <w:rFonts w:ascii="Courier New" w:hAnsi="Courier New" w:eastAsia="Courier New" w:cs="Courier New"/>
+          <w:color w:val="000000"/>
+          <w:sz w:val="20"/>
+          <w:highlight w:val="white"/>
+        </w:rPr>
+        <w:t xml:space="preserve"> </w:t>
+        <w:br/>
+        <w:t xml:space="preserve">       </w:t>
+      </w:r>
+      <w:r>
+        <w:rPr>
+          <w:rFonts w:ascii="Courier New" w:hAnsi="Courier New" w:eastAsia="Courier New" w:cs="Courier New"/>
+          <w:color w:val="b26818"/>
+          <w:sz w:val="20"/>
+          <w:highlight w:val="white"/>
+        </w:rPr>
+        <w:t xml:space="preserve">with open(log_path, 'a') as f:</w:t>
+      </w:r>
+      <w:r>
+        <w:rPr>
+          <w:rFonts w:ascii="Courier New" w:hAnsi="Courier New" w:eastAsia="Courier New" w:cs="Courier New"/>
+          <w:color w:val="000000"/>
+          <w:sz w:val="20"/>
+          <w:highlight w:val="white"/>
+        </w:rPr>
+        <w:t xml:space="preserve"> </w:t>
+        <w:br/>
+        <w:t xml:space="preserve">       </w:t>
+      </w:r>
+      <w:r>
+        <w:rPr>
+          <w:rFonts w:ascii="Courier New" w:hAnsi="Courier New" w:eastAsia="Courier New" w:cs="Courier New"/>
+          <w:color w:val="b26818"/>
+          <w:sz w:val="20"/>
+          <w:highlight w:val="white"/>
+        </w:rPr>
+        <w:t xml:space="preserve">    f.write(json.dumps(entry) + '\n')</w:t>
+      </w:r>
+      <w:r>
+        <w:rPr>
+          <w:rFonts w:ascii="Courier New" w:hAnsi="Courier New" w:eastAsia="Courier New" w:cs="Courier New"/>
+          <w:color w:val="000000"/>
+          <w:sz w:val="20"/>
+          <w:highlight w:val="white"/>
+        </w:rPr>
+        <w:t xml:space="preserve"> </w:t>
+        <w:br/>
+        <w:t xml:space="preserve">       </w:t>
+      </w:r>
+      <w:r>
+        <w:rPr>
+          <w:rFonts w:ascii="Courier New" w:hAnsi="Courier New" w:eastAsia="Courier New" w:cs="Courier New"/>
+          <w:color w:val="b26818"/>
+          <w:sz w:val="20"/>
+          <w:highlight w:val="white"/>
+        </w:rPr>
+        <w:t xml:space="preserve">print('Loggrad skriven!')</w:t>
+      </w:r>
+      <w:r>
+        <w:rPr>
+          <w:rFonts w:ascii="Courier New" w:hAnsi="Courier New" w:eastAsia="Courier New" w:cs="Courier New"/>
+          <w:color w:val="000000"/>
+          <w:sz w:val="20"/>
+          <w:highlight w:val="white"/>
+        </w:rPr>
+        <w:t xml:space="preserve"> </w:t>
+        <w:br/>
+        <w:t xml:space="preserve">       </w:t>
+      </w:r>
+      <w:r>
+        <w:rPr>
+          <w:rFonts w:ascii="Courier New" w:hAnsi="Courier New" w:eastAsia="Courier New" w:cs="Courier New"/>
+          <w:color w:val="b26818"/>
+          <w:sz w:val="20"/>
+          <w:highlight w:val="white"/>
+        </w:rPr>
+        <w:t xml:space="preserve">"</w:t>
+      </w:r>
+      <w:r>
+        <w:rPr>
+          <w:rFonts w:ascii="Courier New" w:hAnsi="Courier New" w:eastAsia="Courier New" w:cs="Courier New"/>
+          <w:color w:val="000000"/>
+          <w:sz w:val="20"/>
+          <w:highlight w:val="white"/>
+        </w:rPr>
+        <w:t xml:space="preserve"> </w:t>
+      </w:r>
+      <w:r>
+        <w:rPr>
+          <w:rFonts w:ascii="Courier New" w:hAnsi="Courier New" w:eastAsia="Courier New" w:cs="Courier New"/>
+          <w:color w:val="54ffff"/>
+          <w:sz w:val="20"/>
+          <w:highlight w:val="white"/>
+        </w:rPr>
+        <w:t xml:space="preserve">&amp;&amp;</w:t>
+      </w:r>
+      <w:r>
+        <w:rPr>
+          <w:rFonts w:ascii="Courier New" w:hAnsi="Courier New" w:eastAsia="Courier New" w:cs="Courier New"/>
+          <w:color w:val="000000"/>
+          <w:sz w:val="20"/>
+          <w:highlight w:val="white"/>
+        </w:rPr>
+        <w:t xml:space="preserve"> date</w:t>
+        <w:br/>
+        <w:t xml:space="preserve"> </w:t>
+      </w:r>
       <w:r>
         <w:rPr>
           <w:highlight w:val="none"/>
@@ -844,6 +1235,2000 @@
           <w:rFonts w:ascii="Courier New" w:hAnsi="Courier New" w:eastAsia="Courier New" w:cs="Courier New"/>
           <w:sz w:val="20"/>
           <w:szCs w:val="20"/>
+        </w:rPr>
+      </w:r>
+    </w:p>
+    <w:p>
+      <w:pPr>
+        <w:pBdr>
+          <w:top w:val="none" w:color="000000" w:sz="4" w:space="0"/>
+          <w:left w:val="none" w:color="000000" w:sz="4" w:space="0"/>
+          <w:bottom w:val="none" w:color="000000" w:sz="4" w:space="0"/>
+          <w:right w:val="none" w:color="000000" w:sz="4" w:space="0"/>
+        </w:pBdr>
+        <w:spacing/>
+        <w:ind w:right="0" w:firstLine="0" w:left="0"/>
+        <w:rPr>
+          <w:highlight w:val="none"/>
+          <w:lang w:val="sv-SE"/>
+        </w:rPr>
+      </w:pPr>
+      <w:r>
+        <w:rPr>
+          <w:highlight w:val="none"/>
+          <w:lang w:val="sv-SE"/>
+        </w:rPr>
+        <w:t xml:space="preserve">Token i fish shell:</w:t>
+        <w:br/>
+      </w:r>
+      <w:r>
+        <w:rPr>
+          <w:rFonts w:ascii="Courier New" w:hAnsi="Courier New" w:eastAsia="Courier New" w:cs="Courier New"/>
+          <w:color w:val="000000"/>
+          <w:sz w:val="20"/>
+          <w:highlight w:val="white"/>
+        </w:rPr>
+        <w:t xml:space="preserve">set </w:t>
+      </w:r>
+      <w:r>
+        <w:rPr>
+          <w:rFonts w:ascii="Courier New" w:hAnsi="Courier New" w:eastAsia="Courier New" w:cs="Courier New"/>
+          <w:color w:val="18b2b2"/>
+          <w:sz w:val="20"/>
+          <w:highlight w:val="white"/>
+        </w:rPr>
+        <w:t xml:space="preserve">-gx</w:t>
+      </w:r>
+      <w:r>
+        <w:rPr>
+          <w:rFonts w:ascii="Courier New" w:hAnsi="Courier New" w:eastAsia="Courier New" w:cs="Courier New"/>
+          <w:color w:val="000000"/>
+          <w:sz w:val="20"/>
+          <w:highlight w:val="white"/>
+        </w:rPr>
+        <w:t xml:space="preserve"> </w:t>
+      </w:r>
+      <w:r>
+        <w:rPr>
+          <w:rFonts w:ascii="Courier New" w:hAnsi="Courier New" w:eastAsia="Courier New" w:cs="Courier New"/>
+          <w:color w:val="18b2b2"/>
+          <w:sz w:val="20"/>
+          <w:highlight w:val="white"/>
+        </w:rPr>
+        <w:t xml:space="preserve">TOKEN</w:t>
+      </w:r>
+      <w:r>
+        <w:rPr>
+          <w:rFonts w:ascii="Courier New" w:hAnsi="Courier New" w:eastAsia="Courier New" w:cs="Courier New"/>
+          <w:color w:val="000000"/>
+          <w:sz w:val="20"/>
+          <w:highlight w:val="white"/>
+        </w:rPr>
+        <w:t xml:space="preserve"> </w:t>
+      </w:r>
+      <w:r>
+        <w:rPr>
+          <w:rFonts w:ascii="Courier New" w:hAnsi="Courier New" w:eastAsia="Courier New" w:cs="Courier New"/>
+          <w:color w:val="54ffff"/>
+          <w:sz w:val="20"/>
+          <w:highlight w:val="white"/>
+        </w:rPr>
+        <w:t xml:space="preserve">(</w:t>
+      </w:r>
+      <w:r>
+        <w:rPr>
+          <w:rFonts w:ascii="Courier New" w:hAnsi="Courier New" w:eastAsia="Courier New" w:cs="Courier New"/>
+          <w:color w:val="000000"/>
+          <w:sz w:val="20"/>
+          <w:highlight w:val="white"/>
+        </w:rPr>
+        <w:t xml:space="preserve">curl </w:t>
+      </w:r>
+      <w:r>
+        <w:rPr>
+          <w:rFonts w:ascii="Courier New" w:hAnsi="Courier New" w:eastAsia="Courier New" w:cs="Courier New"/>
+          <w:color w:val="18b2b2"/>
+          <w:sz w:val="20"/>
+          <w:highlight w:val="white"/>
+        </w:rPr>
+        <w:t xml:space="preserve">-k</w:t>
+      </w:r>
+      <w:r>
+        <w:rPr>
+          <w:rFonts w:ascii="Courier New" w:hAnsi="Courier New" w:eastAsia="Courier New" w:cs="Courier New"/>
+          <w:color w:val="000000"/>
+          <w:sz w:val="20"/>
+          <w:highlight w:val="white"/>
+        </w:rPr>
+        <w:t xml:space="preserve"> </w:t>
+      </w:r>
+      <w:r>
+        <w:rPr>
+          <w:rFonts w:ascii="Courier New" w:hAnsi="Courier New" w:eastAsia="Courier New" w:cs="Courier New"/>
+          <w:color w:val="18b2b2"/>
+          <w:sz w:val="20"/>
+          <w:highlight w:val="white"/>
+        </w:rPr>
+        <w:t xml:space="preserve">-u</w:t>
+      </w:r>
+      <w:r>
+        <w:rPr>
+          <w:rFonts w:ascii="Courier New" w:hAnsi="Courier New" w:eastAsia="Courier New" w:cs="Courier New"/>
+          <w:color w:val="000000"/>
+          <w:sz w:val="20"/>
+          <w:highlight w:val="white"/>
+        </w:rPr>
+        <w:t xml:space="preserve"> </w:t>
+      </w:r>
+      <w:r>
+        <w:rPr>
+          <w:rFonts w:ascii="Courier New" w:hAnsi="Courier New" w:eastAsia="Courier New" w:cs="Courier New"/>
+          <w:color w:val="b26818"/>
+          <w:sz w:val="20"/>
+          <w:highlight w:val="white"/>
+        </w:rPr>
+        <w:t xml:space="preserve">'wazuh-wui:MyS3cr37P450r.*-'</w:t>
+      </w:r>
+      <w:r>
+        <w:rPr>
+          <w:rFonts w:ascii="Courier New" w:hAnsi="Courier New" w:eastAsia="Courier New" w:cs="Courier New"/>
+          <w:color w:val="000000"/>
+          <w:sz w:val="20"/>
+          <w:highlight w:val="white"/>
+        </w:rPr>
+        <w:t xml:space="preserve"> </w:t>
+      </w:r>
+      <w:r>
+        <w:rPr>
+          <w:rFonts w:ascii="Courier New" w:hAnsi="Courier New" w:eastAsia="Courier New" w:cs="Courier New"/>
+          <w:color w:val="18b2b2"/>
+          <w:sz w:val="20"/>
+          <w:highlight w:val="white"/>
+        </w:rPr>
+        <w:t xml:space="preserve">-X</w:t>
+      </w:r>
+      <w:r>
+        <w:rPr>
+          <w:rFonts w:ascii="Courier New" w:hAnsi="Courier New" w:eastAsia="Courier New" w:cs="Courier New"/>
+          <w:color w:val="000000"/>
+          <w:sz w:val="20"/>
+          <w:highlight w:val="white"/>
+        </w:rPr>
+        <w:t xml:space="preserve"> </w:t>
+      </w:r>
+      <w:r>
+        <w:rPr>
+          <w:rFonts w:ascii="Courier New" w:hAnsi="Courier New" w:eastAsia="Courier New" w:cs="Courier New"/>
+          <w:color w:val="18b2b2"/>
+          <w:sz w:val="20"/>
+          <w:highlight w:val="white"/>
+        </w:rPr>
+        <w:t xml:space="preserve">GET</w:t>
+      </w:r>
+      <w:r>
+        <w:rPr>
+          <w:rFonts w:ascii="Courier New" w:hAnsi="Courier New" w:eastAsia="Courier New" w:cs="Courier New"/>
+          <w:color w:val="000000"/>
+          <w:sz w:val="20"/>
+          <w:highlight w:val="white"/>
+        </w:rPr>
+        <w:t xml:space="preserve"> </w:t>
+      </w:r>
+      <w:r>
+        <w:rPr>
+          <w:rFonts w:ascii="Courier New" w:hAnsi="Courier New" w:eastAsia="Courier New" w:cs="Courier New"/>
+          <w:color w:val="b26818"/>
+          <w:sz w:val="20"/>
+          <w:highlight w:val="white"/>
+        </w:rPr>
+        <w:t xml:space="preserve">"https://localhost:55000/security/user/authenticate"</w:t>
+      </w:r>
+      <w:r>
+        <w:rPr>
+          <w:rFonts w:ascii="Courier New" w:hAnsi="Courier New" w:eastAsia="Courier New" w:cs="Courier New"/>
+          <w:color w:val="000000"/>
+          <w:sz w:val="20"/>
+          <w:highlight w:val="white"/>
+        </w:rPr>
+        <w:t xml:space="preserve"> </w:t>
+      </w:r>
+      <w:r>
+        <w:rPr>
+          <w:rFonts w:ascii="Courier New" w:hAnsi="Courier New" w:eastAsia="Courier New" w:cs="Courier New"/>
+          <w:color w:val="18b218"/>
+          <w:sz w:val="20"/>
+          <w:highlight w:val="white"/>
+        </w:rPr>
+        <w:t xml:space="preserve">|</w:t>
+      </w:r>
+      <w:r>
+        <w:rPr>
+          <w:rFonts w:ascii="Courier New" w:hAnsi="Courier New" w:eastAsia="Courier New" w:cs="Courier New"/>
+          <w:color w:val="000000"/>
+          <w:sz w:val="20"/>
+          <w:highlight w:val="white"/>
+        </w:rPr>
+        <w:t xml:space="preserve"> jq </w:t>
+      </w:r>
+      <w:r>
+        <w:rPr>
+          <w:rFonts w:ascii="Courier New" w:hAnsi="Courier New" w:eastAsia="Courier New" w:cs="Courier New"/>
+          <w:color w:val="18b2b2"/>
+          <w:sz w:val="20"/>
+          <w:highlight w:val="white"/>
+        </w:rPr>
+        <w:t xml:space="preserve">-r</w:t>
+        <w:br/>
+      </w:r>
+      <w:r>
+        <w:rPr>
+          <w:rFonts w:ascii="Courier New" w:hAnsi="Courier New" w:eastAsia="Courier New" w:cs="Courier New"/>
+          <w:color w:val="000000"/>
+          <w:sz w:val="20"/>
+          <w:highlight w:val="white"/>
+        </w:rPr>
+        <w:t xml:space="preserve"> </w:t>
+      </w:r>
+      <w:r>
+        <w:rPr>
+          <w:rFonts w:ascii="Courier New" w:hAnsi="Courier New" w:eastAsia="Courier New" w:cs="Courier New"/>
+          <w:color w:val="18b2b2"/>
+          <w:sz w:val="20"/>
+          <w:highlight w:val="white"/>
+        </w:rPr>
+        <w:t xml:space="preserve">.data.token</w:t>
+      </w:r>
+      <w:r>
+        <w:rPr>
+          <w:rFonts w:ascii="Courier New" w:hAnsi="Courier New" w:eastAsia="Courier New" w:cs="Courier New"/>
+          <w:color w:val="54ffff"/>
+          <w:sz w:val="20"/>
+          <w:highlight w:val="white"/>
+        </w:rPr>
+        <w:t xml:space="preserve">)</w:t>
+        <w:br/>
+      </w:r>
+      <w:r>
+        <w:rPr>
+          <w:rFonts w:ascii="Courier New" w:hAnsi="Courier New" w:eastAsia="Courier New" w:cs="Courier New"/>
+          <w:color w:val="000000"/>
+          <w:sz w:val="20"/>
+          <w:highlight w:val="white"/>
+        </w:rPr>
+        <w:t xml:space="preserve"> </w:t>
+      </w:r>
+      <w:r>
+        <w:rPr>
+          <w:highlight w:val="none"/>
+          <w:lang w:val="sv-SE"/>
+        </w:rPr>
+        <w:br/>
+      </w:r>
+      <w:r>
+        <w:rPr>
+          <w:highlight w:val="none"/>
+          <w:lang w:val="sv-SE"/>
+        </w:rPr>
+        <w:t xml:space="preserve">Kommandot som använder Token:</w:t>
+        <w:br/>
+      </w:r>
+      <w:r>
+        <w:rPr>
+          <w:rFonts w:ascii="Courier New" w:hAnsi="Courier New" w:eastAsia="Courier New" w:cs="Courier New"/>
+          <w:color w:val="000000"/>
+          <w:sz w:val="20"/>
+          <w:highlight w:val="white"/>
+        </w:rPr>
+        <w:t xml:space="preserve">curl </w:t>
+      </w:r>
+      <w:r>
+        <w:rPr>
+          <w:rFonts w:ascii="Courier New" w:hAnsi="Courier New" w:eastAsia="Courier New" w:cs="Courier New"/>
+          <w:color w:val="18b2b2"/>
+          <w:sz w:val="20"/>
+          <w:highlight w:val="white"/>
+        </w:rPr>
+        <w:t xml:space="preserve">-k</w:t>
+      </w:r>
+      <w:r>
+        <w:rPr>
+          <w:rFonts w:ascii="Courier New" w:hAnsi="Courier New" w:eastAsia="Courier New" w:cs="Courier New"/>
+          <w:color w:val="000000"/>
+          <w:sz w:val="20"/>
+          <w:highlight w:val="white"/>
+        </w:rPr>
+        <w:t xml:space="preserve"> </w:t>
+      </w:r>
+      <w:r>
+        <w:rPr>
+          <w:rFonts w:ascii="Courier New" w:hAnsi="Courier New" w:eastAsia="Courier New" w:cs="Courier New"/>
+          <w:color w:val="18b2b2"/>
+          <w:sz w:val="20"/>
+          <w:highlight w:val="white"/>
+        </w:rPr>
+        <w:t xml:space="preserve">-X</w:t>
+      </w:r>
+      <w:r>
+        <w:rPr>
+          <w:rFonts w:ascii="Courier New" w:hAnsi="Courier New" w:eastAsia="Courier New" w:cs="Courier New"/>
+          <w:color w:val="000000"/>
+          <w:sz w:val="20"/>
+          <w:highlight w:val="white"/>
+        </w:rPr>
+        <w:t xml:space="preserve"> </w:t>
+      </w:r>
+      <w:r>
+        <w:rPr>
+          <w:rFonts w:ascii="Courier New" w:hAnsi="Courier New" w:eastAsia="Courier New" w:cs="Courier New"/>
+          <w:color w:val="18b2b2"/>
+          <w:sz w:val="20"/>
+          <w:highlight w:val="white"/>
+        </w:rPr>
+        <w:t xml:space="preserve">POST</w:t>
+      </w:r>
+      <w:r>
+        <w:rPr>
+          <w:rFonts w:ascii="Courier New" w:hAnsi="Courier New" w:eastAsia="Courier New" w:cs="Courier New"/>
+          <w:color w:val="000000"/>
+          <w:sz w:val="20"/>
+          <w:highlight w:val="white"/>
+        </w:rPr>
+        <w:t xml:space="preserve"> </w:t>
+      </w:r>
+      <w:r>
+        <w:rPr>
+          <w:rFonts w:ascii="Courier New" w:hAnsi="Courier New" w:eastAsia="Courier New" w:cs="Courier New"/>
+          <w:color w:val="b26818"/>
+          <w:sz w:val="20"/>
+          <w:highlight w:val="white"/>
+        </w:rPr>
+        <w:t xml:space="preserve">"https://localhost:55000/events"</w:t>
+      </w:r>
+      <w:r>
+        <w:rPr>
+          <w:rFonts w:ascii="Courier New" w:hAnsi="Courier New" w:eastAsia="Courier New" w:cs="Courier New"/>
+          <w:color w:val="000000"/>
+          <w:sz w:val="20"/>
+          <w:highlight w:val="white"/>
+        </w:rPr>
+        <w:t xml:space="preserve"> \ </w:t>
+        <w:br/>
+        <w:t xml:space="preserve">                </w:t>
+      </w:r>
+      <w:r>
+        <w:rPr>
+          <w:rFonts w:ascii="Courier New" w:hAnsi="Courier New" w:eastAsia="Courier New" w:cs="Courier New"/>
+          <w:color w:val="18b2b2"/>
+          <w:sz w:val="20"/>
+          <w:highlight w:val="white"/>
+        </w:rPr>
+        <w:t xml:space="preserve">-H</w:t>
+      </w:r>
+      <w:r>
+        <w:rPr>
+          <w:rFonts w:ascii="Courier New" w:hAnsi="Courier New" w:eastAsia="Courier New" w:cs="Courier New"/>
+          <w:color w:val="000000"/>
+          <w:sz w:val="20"/>
+          <w:highlight w:val="white"/>
+        </w:rPr>
+        <w:t xml:space="preserve"> </w:t>
+      </w:r>
+      <w:r>
+        <w:rPr>
+          <w:rFonts w:ascii="Courier New" w:hAnsi="Courier New" w:eastAsia="Courier New" w:cs="Courier New"/>
+          <w:color w:val="b26818"/>
+          <w:sz w:val="20"/>
+          <w:highlight w:val="white"/>
+        </w:rPr>
+        <w:t xml:space="preserve">"Authorization: Bearer </w:t>
+      </w:r>
+      <w:r>
+        <w:rPr>
+          <w:rFonts w:ascii="Courier New" w:hAnsi="Courier New" w:eastAsia="Courier New" w:cs="Courier New"/>
+          <w:color w:val="54ffff"/>
+          <w:sz w:val="20"/>
+          <w:highlight w:val="white"/>
+        </w:rPr>
+        <w:t xml:space="preserve">$TOKEN</w:t>
+      </w:r>
+      <w:r>
+        <w:rPr>
+          <w:rFonts w:ascii="Courier New" w:hAnsi="Courier New" w:eastAsia="Courier New" w:cs="Courier New"/>
+          <w:color w:val="b26818"/>
+          <w:sz w:val="20"/>
+          <w:highlight w:val="white"/>
+        </w:rPr>
+        <w:t xml:space="preserve">"</w:t>
+      </w:r>
+      <w:r>
+        <w:rPr>
+          <w:rFonts w:ascii="Courier New" w:hAnsi="Courier New" w:eastAsia="Courier New" w:cs="Courier New"/>
+          <w:color w:val="000000"/>
+          <w:sz w:val="20"/>
+          <w:highlight w:val="white"/>
+        </w:rPr>
+        <w:t xml:space="preserve"> \ </w:t>
+        <w:br/>
+        <w:t xml:space="preserve">                </w:t>
+      </w:r>
+      <w:r>
+        <w:rPr>
+          <w:rFonts w:ascii="Courier New" w:hAnsi="Courier New" w:eastAsia="Courier New" w:cs="Courier New"/>
+          <w:color w:val="18b2b2"/>
+          <w:sz w:val="20"/>
+          <w:highlight w:val="white"/>
+        </w:rPr>
+        <w:t xml:space="preserve">-H</w:t>
+      </w:r>
+      <w:r>
+        <w:rPr>
+          <w:rFonts w:ascii="Courier New" w:hAnsi="Courier New" w:eastAsia="Courier New" w:cs="Courier New"/>
+          <w:color w:val="000000"/>
+          <w:sz w:val="20"/>
+          <w:highlight w:val="white"/>
+        </w:rPr>
+        <w:t xml:space="preserve"> </w:t>
+      </w:r>
+      <w:r>
+        <w:rPr>
+          <w:rFonts w:ascii="Courier New" w:hAnsi="Courier New" w:eastAsia="Courier New" w:cs="Courier New"/>
+          <w:color w:val="b26818"/>
+          <w:sz w:val="20"/>
+          <w:highlight w:val="white"/>
+        </w:rPr>
+        <w:t xml:space="preserve">'Content-Type: application/json'</w:t>
+      </w:r>
+      <w:r>
+        <w:rPr>
+          <w:rFonts w:ascii="Courier New" w:hAnsi="Courier New" w:eastAsia="Courier New" w:cs="Courier New"/>
+          <w:color w:val="000000"/>
+          <w:sz w:val="20"/>
+          <w:highlight w:val="white"/>
+        </w:rPr>
+        <w:t xml:space="preserve"> \ </w:t>
+        <w:br/>
+        <w:t xml:space="preserve">                </w:t>
+      </w:r>
+      <w:r>
+        <w:rPr>
+          <w:rFonts w:ascii="Courier New" w:hAnsi="Courier New" w:eastAsia="Courier New" w:cs="Courier New"/>
+          <w:color w:val="18b2b2"/>
+          <w:sz w:val="20"/>
+          <w:highlight w:val="white"/>
+        </w:rPr>
+        <w:t xml:space="preserve">-d</w:t>
+      </w:r>
+      <w:r>
+        <w:rPr>
+          <w:rFonts w:ascii="Courier New" w:hAnsi="Courier New" w:eastAsia="Courier New" w:cs="Courier New"/>
+          <w:color w:val="000000"/>
+          <w:sz w:val="20"/>
+          <w:highlight w:val="white"/>
+        </w:rPr>
+        <w:t xml:space="preserve"> </w:t>
+      </w:r>
+      <w:r>
+        <w:rPr>
+          <w:rFonts w:ascii="Courier New" w:hAnsi="Courier New" w:eastAsia="Courier New" w:cs="Courier New"/>
+          <w:color w:val="b26818"/>
+          <w:sz w:val="20"/>
+          <w:highlight w:val="white"/>
+        </w:rPr>
+        <w:t xml:space="preserve">'{</w:t>
+      </w:r>
+      <w:r>
+        <w:rPr>
+          <w:rFonts w:ascii="Courier New" w:hAnsi="Courier New" w:eastAsia="Courier New" w:cs="Courier New"/>
+          <w:color w:val="000000"/>
+          <w:sz w:val="20"/>
+          <w:highlight w:val="white"/>
+        </w:rPr>
+        <w:t xml:space="preserve"> </w:t>
+        <w:br/>
+        <w:t xml:space="preserve">       </w:t>
+      </w:r>
+      <w:r>
+        <w:rPr>
+          <w:rFonts w:ascii="Courier New" w:hAnsi="Courier New" w:eastAsia="Courier New" w:cs="Courier New"/>
+          <w:color w:val="b26818"/>
+          <w:sz w:val="20"/>
+          <w:highlight w:val="white"/>
+        </w:rPr>
+        <w:t xml:space="preserve">          "events": [</w:t>
+      </w:r>
+      <w:r>
+        <w:rPr>
+          <w:rFonts w:ascii="Courier New" w:hAnsi="Courier New" w:eastAsia="Courier New" w:cs="Courier New"/>
+          <w:color w:val="000000"/>
+          <w:sz w:val="20"/>
+          <w:highlight w:val="white"/>
+        </w:rPr>
+        <w:t xml:space="preserve"> </w:t>
+        <w:br/>
+        <w:t xml:space="preserve">       </w:t>
+      </w:r>
+      <w:r>
+        <w:rPr>
+          <w:rFonts w:ascii="Courier New" w:hAnsi="Courier New" w:eastAsia="Courier New" w:cs="Courier New"/>
+          <w:color w:val="b26818"/>
+          <w:sz w:val="20"/>
+          <w:highlight w:val="white"/>
+        </w:rPr>
+        <w:t xml:space="preserve">            "1:ai_anomaly:AI-stödd detektion identifierade avvikande aktivitet"</w:t>
+      </w:r>
+      <w:r>
+        <w:rPr>
+          <w:rFonts w:ascii="Courier New" w:hAnsi="Courier New" w:eastAsia="Courier New" w:cs="Courier New"/>
+          <w:color w:val="000000"/>
+          <w:sz w:val="20"/>
+          <w:highlight w:val="white"/>
+        </w:rPr>
+        <w:t xml:space="preserve"> </w:t>
+        <w:br/>
+        <w:t xml:space="preserve">       </w:t>
+      </w:r>
+      <w:r>
+        <w:rPr>
+          <w:rFonts w:ascii="Courier New" w:hAnsi="Courier New" w:eastAsia="Courier New" w:cs="Courier New"/>
+          <w:color w:val="b26818"/>
+          <w:sz w:val="20"/>
+          <w:highlight w:val="white"/>
+        </w:rPr>
+        <w:t xml:space="preserve">          ]</w:t>
+      </w:r>
+      <w:r>
+        <w:rPr>
+          <w:rFonts w:ascii="Courier New" w:hAnsi="Courier New" w:eastAsia="Courier New" w:cs="Courier New"/>
+          <w:color w:val="000000"/>
+          <w:sz w:val="20"/>
+          <w:highlight w:val="white"/>
+        </w:rPr>
+        <w:t xml:space="preserve"> </w:t>
+        <w:br/>
+        <w:t xml:space="preserve">       </w:t>
+      </w:r>
+      <w:r>
+        <w:rPr>
+          <w:rFonts w:ascii="Courier New" w:hAnsi="Courier New" w:eastAsia="Courier New" w:cs="Courier New"/>
+          <w:color w:val="b26818"/>
+          <w:sz w:val="20"/>
+          <w:highlight w:val="white"/>
+        </w:rPr>
+        <w:t xml:space="preserve">        }'</w:t>
+        <w:br/>
+      </w:r>
+      <w:r>
+        <w:rPr>
+          <w:rFonts w:ascii="Courier New" w:hAnsi="Courier New" w:eastAsia="Courier New" w:cs="Courier New"/>
+          <w:color w:val="000000"/>
+          <w:sz w:val="20"/>
+          <w:highlight w:val="white"/>
+        </w:rPr>
+        <w:t xml:space="preserve"> </w:t>
+      </w:r>
+      <w:r>
+        <w:rPr>
+          <w:highlight w:val="none"/>
+          <w:lang w:val="sv-SE"/>
+        </w:rPr>
+      </w:r>
+      <w:r>
+        <w:rPr>
+          <w:rFonts w:ascii="Courier New" w:hAnsi="Courier New" w:eastAsia="Courier New" w:cs="Courier New"/>
+          <w:sz w:val="20"/>
+          <w:szCs w:val="20"/>
+        </w:rPr>
+      </w:r>
+    </w:p>
+    <w:p>
+      <w:pPr>
+        <w:pBdr/>
+        <w:shd w:val="nil"/>
+        <w:spacing/>
+        <w:ind/>
+        <w:rPr>
+          <w:rFonts w:ascii="Courier New" w:hAnsi="Courier New" w:eastAsia="Courier New" w:cs="Courier New"/>
+          <w:sz w:val="20"/>
+          <w:szCs w:val="20"/>
+        </w:rPr>
+      </w:pPr>
+      <w:r>
+        <w:rPr>
+          <w:rFonts w:ascii="Courier New" w:hAnsi="Courier New" w:eastAsia="Courier New" w:cs="Courier New"/>
+          <w:sz w:val="20"/>
+          <w:szCs w:val="20"/>
+        </w:rPr>
+        <w:br w:type="page" w:clear="all"/>
+      </w:r>
+      <w:r>
+        <w:rPr>
+          <w:rFonts w:ascii="Courier New" w:hAnsi="Courier New" w:eastAsia="Courier New" w:cs="Courier New"/>
+          <w:sz w:val="20"/>
+          <w:szCs w:val="20"/>
+        </w:rPr>
+      </w:r>
+      <w:r>
+        <w:rPr>
+          <w:rFonts w:ascii="Courier New" w:hAnsi="Courier New" w:eastAsia="Courier New" w:cs="Courier New"/>
+          <w:sz w:val="20"/>
+          <w:szCs w:val="20"/>
+        </w:rPr>
+      </w:r>
+    </w:p>
+    <w:p>
+      <w:pPr>
+        <w:pBdr>
+          <w:top w:val="none" w:color="000000" w:sz="4" w:space="0"/>
+          <w:left w:val="none" w:color="000000" w:sz="4" w:space="0"/>
+          <w:bottom w:val="none" w:color="000000" w:sz="4" w:space="0"/>
+          <w:right w:val="none" w:color="000000" w:sz="4" w:space="0"/>
+        </w:pBdr>
+        <w:spacing/>
+        <w:ind w:right="0" w:firstLine="0" w:left="0"/>
+        <w:rPr>
+          <w:highlight w:val="none"/>
+          <w:lang w:val="sv-SE"/>
+        </w:rPr>
+      </w:pPr>
+      <w:r>
+        <w:rPr>
+          <w:highlight w:val="none"/>
+          <w:lang w:val="sv-SE"/>
+        </w:rPr>
+        <w:t xml:space="preserve">Del 3-specifika:</w:t>
+      </w:r>
+      <w:r>
+        <w:rPr>
+          <w:rFonts w:ascii="Courier New" w:hAnsi="Courier New" w:eastAsia="Courier New" w:cs="Courier New"/>
+          <w:sz w:val="20"/>
+          <w:szCs w:val="20"/>
+        </w:rPr>
+      </w:r>
+    </w:p>
+    <w:p>
+      <w:pPr>
+        <w:pBdr>
+          <w:top w:val="none" w:color="000000" w:sz="4" w:space="0"/>
+          <w:left w:val="none" w:color="000000" w:sz="4" w:space="0"/>
+          <w:bottom w:val="none" w:color="000000" w:sz="4" w:space="0"/>
+          <w:right w:val="none" w:color="000000" w:sz="4" w:space="0"/>
+        </w:pBdr>
+        <w:spacing/>
+        <w:ind w:right="0" w:firstLine="0" w:left="0"/>
+        <w:rPr>
+          <w:rFonts w:ascii="Courier New" w:hAnsi="Courier New" w:eastAsia="Courier New" w:cs="Courier New"/>
+          <w:color w:val="18b2b2"/>
+          <w:sz w:val="20"/>
+          <w:szCs w:val="20"/>
+          <w:highlight w:val="none"/>
+        </w:rPr>
+      </w:pPr>
+      <w:r>
+        <w:rPr>
+          <w:highlight w:val="none"/>
+          <w:lang w:val="sv-SE"/>
+        </w:rPr>
+        <w:t xml:space="preserve">För att få data:</w:t>
+        <w:br/>
+      </w:r>
+      <w:r>
+        <w:rPr>
+          <w:rFonts w:ascii="Courier New" w:hAnsi="Courier New" w:eastAsia="Courier New" w:cs="Courier New"/>
+          <w:color w:val="000000"/>
+          <w:sz w:val="20"/>
+          <w:highlight w:val="white"/>
+        </w:rPr>
+        <w:t xml:space="preserve">sudo </w:t>
+      </w:r>
+      <w:r>
+        <w:rPr>
+          <w:rFonts w:ascii="Courier New" w:hAnsi="Courier New" w:eastAsia="Courier New" w:cs="Courier New"/>
+          <w:color w:val="18b2b2"/>
+          <w:sz w:val="20"/>
+          <w:highlight w:val="white"/>
+        </w:rPr>
+        <w:t xml:space="preserve">nmap</w:t>
+      </w:r>
+      <w:r>
+        <w:rPr>
+          <w:rFonts w:ascii="Courier New" w:hAnsi="Courier New" w:eastAsia="Courier New" w:cs="Courier New"/>
+          <w:color w:val="000000"/>
+          <w:sz w:val="20"/>
+          <w:highlight w:val="white"/>
+        </w:rPr>
+        <w:t xml:space="preserve"> </w:t>
+      </w:r>
+      <w:r>
+        <w:rPr>
+          <w:rFonts w:ascii="Courier New" w:hAnsi="Courier New" w:eastAsia="Courier New" w:cs="Courier New"/>
+          <w:color w:val="18b2b2"/>
+          <w:sz w:val="20"/>
+          <w:highlight w:val="white"/>
+        </w:rPr>
+        <w:t xml:space="preserve">-sS</w:t>
+      </w:r>
+      <w:r>
+        <w:rPr>
+          <w:rFonts w:ascii="Courier New" w:hAnsi="Courier New" w:eastAsia="Courier New" w:cs="Courier New"/>
+          <w:color w:val="000000"/>
+          <w:sz w:val="20"/>
+          <w:highlight w:val="white"/>
+        </w:rPr>
+        <w:t xml:space="preserve"> </w:t>
+      </w:r>
+      <w:r>
+        <w:rPr>
+          <w:rFonts w:ascii="Courier New" w:hAnsi="Courier New" w:eastAsia="Courier New" w:cs="Courier New"/>
+          <w:color w:val="18b2b2"/>
+          <w:sz w:val="20"/>
+          <w:highlight w:val="white"/>
+        </w:rPr>
+        <w:t xml:space="preserve">-sV</w:t>
+      </w:r>
+      <w:r>
+        <w:rPr>
+          <w:rFonts w:ascii="Courier New" w:hAnsi="Courier New" w:eastAsia="Courier New" w:cs="Courier New"/>
+          <w:color w:val="000000"/>
+          <w:sz w:val="20"/>
+          <w:highlight w:val="white"/>
+        </w:rPr>
+        <w:t xml:space="preserve"> </w:t>
+      </w:r>
+      <w:r>
+        <w:rPr>
+          <w:rFonts w:ascii="Courier New" w:hAnsi="Courier New" w:eastAsia="Courier New" w:cs="Courier New"/>
+          <w:color w:val="18b2b2"/>
+          <w:sz w:val="20"/>
+          <w:highlight w:val="white"/>
+        </w:rPr>
+        <w:t xml:space="preserve">localhost</w:t>
+      </w:r>
+      <w:r>
+        <w:rPr>
+          <w:rFonts w:ascii="Courier New" w:hAnsi="Courier New" w:eastAsia="Courier New" w:cs="Courier New"/>
+          <w:sz w:val="20"/>
+          <w:szCs w:val="20"/>
+        </w:rPr>
+      </w:r>
+      <w:r>
+        <w:rPr>
+          <w:rFonts w:ascii="Courier New" w:hAnsi="Courier New" w:eastAsia="Courier New" w:cs="Courier New"/>
+          <w:color w:val="18b2b2"/>
+          <w:sz w:val="20"/>
+          <w:highlight w:val="none"/>
+        </w:rPr>
+      </w:r>
+      <w:r>
+        <w:rPr>
+          <w:rFonts w:ascii="Courier New" w:hAnsi="Courier New" w:eastAsia="Courier New" w:cs="Courier New"/>
+          <w:color w:val="18b2b2"/>
+          <w:sz w:val="20"/>
+          <w:highlight w:val="none"/>
+        </w:rPr>
+      </w:r>
+      <w:r>
+        <w:rPr>
+          <w:rFonts w:ascii="Courier New" w:hAnsi="Courier New" w:eastAsia="Courier New" w:cs="Courier New"/>
+          <w:color w:val="18b2b2"/>
+          <w:sz w:val="20"/>
+          <w:szCs w:val="20"/>
+          <w:highlight w:val="none"/>
+        </w:rPr>
+      </w:r>
+    </w:p>
+    <w:p>
+      <w:pPr>
+        <w:pBdr>
+          <w:top w:val="none" w:color="000000" w:sz="4" w:space="0"/>
+          <w:left w:val="none" w:color="000000" w:sz="4" w:space="0"/>
+          <w:bottom w:val="none" w:color="000000" w:sz="4" w:space="0"/>
+          <w:right w:val="none" w:color="000000" w:sz="4" w:space="0"/>
+        </w:pBdr>
+        <w:spacing/>
+        <w:ind w:right="0" w:firstLine="0" w:left="0"/>
+        <w:rPr>
+          <w:rFonts w:ascii="Courier New" w:hAnsi="Courier New" w:eastAsia="Courier New" w:cs="Courier New"/>
+          <w:color w:val="18b2b2"/>
+          <w:sz w:val="20"/>
+          <w:szCs w:val="20"/>
+          <w:highlight w:val="none"/>
+          <w:u w:val="single"/>
+        </w:rPr>
+      </w:pPr>
+      <w:r>
+        <w:rPr>
+          <w:rFonts w:ascii="Courier New" w:hAnsi="Courier New" w:eastAsia="Courier New" w:cs="Courier New"/>
+          <w:color w:val="18b2b2"/>
+          <w:sz w:val="20"/>
+          <w:highlight w:val="none"/>
+        </w:rPr>
+      </w:r>
+      <w:r>
+        <w:rPr>
+          <w:rFonts w:ascii="Courier New" w:hAnsi="Courier New" w:eastAsia="Courier New" w:cs="Courier New"/>
+          <w:color w:val="000000"/>
+          <w:sz w:val="20"/>
+          <w:highlight w:val="white"/>
+        </w:rPr>
+        <w:t xml:space="preserve">sudo </w:t>
+      </w:r>
+      <w:r>
+        <w:rPr>
+          <w:rFonts w:ascii="Courier New" w:hAnsi="Courier New" w:eastAsia="Courier New" w:cs="Courier New"/>
+          <w:color w:val="18b2b2"/>
+          <w:sz w:val="20"/>
+          <w:highlight w:val="white"/>
+        </w:rPr>
+        <w:t xml:space="preserve">touch</w:t>
+      </w:r>
+      <w:r>
+        <w:rPr>
+          <w:rFonts w:ascii="Courier New" w:hAnsi="Courier New" w:eastAsia="Courier New" w:cs="Courier New"/>
+          <w:color w:val="000000"/>
+          <w:sz w:val="20"/>
+          <w:highlight w:val="white"/>
+        </w:rPr>
+        <w:t xml:space="preserve"> </w:t>
+      </w:r>
+      <w:r>
+        <w:rPr>
+          <w:rFonts w:ascii="Courier New" w:hAnsi="Courier New" w:eastAsia="Courier New" w:cs="Courier New"/>
+          <w:color w:val="18b2b2"/>
+          <w:sz w:val="20"/>
+          <w:highlight w:val="white"/>
+        </w:rPr>
+        <w:t xml:space="preserve">/etc/sudoers.d/test-fim</w:t>
+      </w:r>
+      <w:r>
+        <w:rPr>
+          <w:rFonts w:ascii="Courier New" w:hAnsi="Courier New" w:eastAsia="Courier New" w:cs="Courier New"/>
+          <w:color w:val="000000"/>
+          <w:sz w:val="20"/>
+          <w:highlight w:val="white"/>
+        </w:rPr>
+        <w:t xml:space="preserve"> </w:t>
+        <w:br/>
+        <w:t xml:space="preserve">       echo </w:t>
+      </w:r>
+      <w:r>
+        <w:rPr>
+          <w:rFonts w:ascii="Courier New" w:hAnsi="Courier New" w:eastAsia="Courier New" w:cs="Courier New"/>
+          <w:color w:val="b26818"/>
+          <w:sz w:val="20"/>
+          <w:highlight w:val="white"/>
+        </w:rPr>
+        <w:t xml:space="preserve">"# FIM test"</w:t>
+      </w:r>
+      <w:r>
+        <w:rPr>
+          <w:rFonts w:ascii="Courier New" w:hAnsi="Courier New" w:eastAsia="Courier New" w:cs="Courier New"/>
+          <w:color w:val="000000"/>
+          <w:sz w:val="20"/>
+          <w:highlight w:val="white"/>
+        </w:rPr>
+        <w:t xml:space="preserve"> </w:t>
+      </w:r>
+      <w:r>
+        <w:rPr>
+          <w:rFonts w:ascii="Courier New" w:hAnsi="Courier New" w:eastAsia="Courier New" w:cs="Courier New"/>
+          <w:color w:val="18b218"/>
+          <w:sz w:val="20"/>
+          <w:highlight w:val="white"/>
+        </w:rPr>
+        <w:t xml:space="preserve">|</w:t>
+      </w:r>
+      <w:r>
+        <w:rPr>
+          <w:rFonts w:ascii="Courier New" w:hAnsi="Courier New" w:eastAsia="Courier New" w:cs="Courier New"/>
+          <w:color w:val="000000"/>
+          <w:sz w:val="20"/>
+          <w:highlight w:val="white"/>
+        </w:rPr>
+        <w:t xml:space="preserve"> sudo </w:t>
+      </w:r>
+      <w:r>
+        <w:rPr>
+          <w:rFonts w:ascii="Courier New" w:hAnsi="Courier New" w:eastAsia="Courier New" w:cs="Courier New"/>
+          <w:color w:val="18b2b2"/>
+          <w:sz w:val="20"/>
+          <w:highlight w:val="white"/>
+        </w:rPr>
+        <w:t xml:space="preserve">tee</w:t>
+      </w:r>
+      <w:r>
+        <w:rPr>
+          <w:rFonts w:ascii="Courier New" w:hAnsi="Courier New" w:eastAsia="Courier New" w:cs="Courier New"/>
+          <w:color w:val="000000"/>
+          <w:sz w:val="20"/>
+          <w:highlight w:val="white"/>
+        </w:rPr>
+        <w:t xml:space="preserve"> </w:t>
+      </w:r>
+      <w:r>
+        <w:rPr>
+          <w:rFonts w:ascii="Courier New" w:hAnsi="Courier New" w:eastAsia="Courier New" w:cs="Courier New"/>
+          <w:color w:val="18b2b2"/>
+          <w:sz w:val="20"/>
+          <w:highlight w:val="white"/>
+        </w:rPr>
+        <w:t xml:space="preserve">-a</w:t>
+      </w:r>
+      <w:r>
+        <w:rPr>
+          <w:rFonts w:ascii="Courier New" w:hAnsi="Courier New" w:eastAsia="Courier New" w:cs="Courier New"/>
+          <w:color w:val="000000"/>
+          <w:sz w:val="20"/>
+          <w:highlight w:val="white"/>
+        </w:rPr>
+        <w:t xml:space="preserve"> </w:t>
+      </w:r>
+      <w:r>
+        <w:rPr>
+          <w:rFonts w:ascii="Courier New" w:hAnsi="Courier New" w:eastAsia="Courier New" w:cs="Courier New"/>
+          <w:color w:val="18b2b2"/>
+          <w:sz w:val="20"/>
+          <w:highlight w:val="white"/>
+          <w:u w:val="single"/>
+        </w:rPr>
+        <w:t xml:space="preserve">/etc/ssh/sshd_config</w:t>
+      </w:r>
+      <w:r>
+        <w:rPr>
+          <w:rFonts w:ascii="Courier New" w:hAnsi="Courier New" w:eastAsia="Courier New" w:cs="Courier New"/>
+          <w:color w:val="000000"/>
+          <w:sz w:val="20"/>
+          <w:highlight w:val="white"/>
+        </w:rPr>
+        <w:t xml:space="preserve"> </w:t>
+        <w:br/>
+        <w:t xml:space="preserve">       sudo </w:t>
+      </w:r>
+      <w:r>
+        <w:rPr>
+          <w:rFonts w:ascii="Courier New" w:hAnsi="Courier New" w:eastAsia="Courier New" w:cs="Courier New"/>
+          <w:color w:val="18b2b2"/>
+          <w:sz w:val="20"/>
+          <w:highlight w:val="white"/>
+        </w:rPr>
+        <w:t xml:space="preserve">rm</w:t>
+      </w:r>
+      <w:r>
+        <w:rPr>
+          <w:rFonts w:ascii="Courier New" w:hAnsi="Courier New" w:eastAsia="Courier New" w:cs="Courier New"/>
+          <w:color w:val="000000"/>
+          <w:sz w:val="20"/>
+          <w:highlight w:val="white"/>
+        </w:rPr>
+        <w:t xml:space="preserve"> </w:t>
+      </w:r>
+      <w:r>
+        <w:rPr>
+          <w:rFonts w:ascii="Courier New" w:hAnsi="Courier New" w:eastAsia="Courier New" w:cs="Courier New"/>
+          <w:color w:val="18b2b2"/>
+          <w:sz w:val="20"/>
+          <w:highlight w:val="white"/>
+        </w:rPr>
+        <w:t xml:space="preserve">/etc/sudoers.d/test-fim</w:t>
+      </w:r>
+      <w:r>
+        <w:rPr>
+          <w:rFonts w:ascii="Courier New" w:hAnsi="Courier New" w:eastAsia="Courier New" w:cs="Courier New"/>
+          <w:color w:val="000000"/>
+          <w:sz w:val="20"/>
+          <w:highlight w:val="white"/>
+        </w:rPr>
+        <w:t xml:space="preserve"> </w:t>
+        <w:br/>
+        <w:t xml:space="preserve">       sudo </w:t>
+      </w:r>
+      <w:r>
+        <w:rPr>
+          <w:rFonts w:ascii="Courier New" w:hAnsi="Courier New" w:eastAsia="Courier New" w:cs="Courier New"/>
+          <w:color w:val="18b2b2"/>
+          <w:sz w:val="20"/>
+          <w:highlight w:val="white"/>
+        </w:rPr>
+        <w:t xml:space="preserve">sed</w:t>
+      </w:r>
+      <w:r>
+        <w:rPr>
+          <w:rFonts w:ascii="Courier New" w:hAnsi="Courier New" w:eastAsia="Courier New" w:cs="Courier New"/>
+          <w:color w:val="000000"/>
+          <w:sz w:val="20"/>
+          <w:highlight w:val="white"/>
+        </w:rPr>
+        <w:t xml:space="preserve"> </w:t>
+      </w:r>
+      <w:r>
+        <w:rPr>
+          <w:rFonts w:ascii="Courier New" w:hAnsi="Courier New" w:eastAsia="Courier New" w:cs="Courier New"/>
+          <w:color w:val="18b2b2"/>
+          <w:sz w:val="20"/>
+          <w:highlight w:val="white"/>
+        </w:rPr>
+        <w:t xml:space="preserve">-i</w:t>
+      </w:r>
+      <w:r>
+        <w:rPr>
+          <w:rFonts w:ascii="Courier New" w:hAnsi="Courier New" w:eastAsia="Courier New" w:cs="Courier New"/>
+          <w:color w:val="000000"/>
+          <w:sz w:val="20"/>
+          <w:highlight w:val="white"/>
+        </w:rPr>
+        <w:t xml:space="preserve"> </w:t>
+      </w:r>
+      <w:r>
+        <w:rPr>
+          <w:rFonts w:ascii="Courier New" w:hAnsi="Courier New" w:eastAsia="Courier New" w:cs="Courier New"/>
+          <w:color w:val="b26818"/>
+          <w:sz w:val="20"/>
+          <w:highlight w:val="white"/>
+        </w:rPr>
+        <w:t xml:space="preserve">'$ d'</w:t>
+      </w:r>
+      <w:r>
+        <w:rPr>
+          <w:rFonts w:ascii="Courier New" w:hAnsi="Courier New" w:eastAsia="Courier New" w:cs="Courier New"/>
+          <w:color w:val="000000"/>
+          <w:sz w:val="20"/>
+          <w:highlight w:val="white"/>
+        </w:rPr>
+        <w:t xml:space="preserve"> </w:t>
+      </w:r>
+      <w:r>
+        <w:rPr>
+          <w:rFonts w:ascii="Courier New" w:hAnsi="Courier New" w:eastAsia="Courier New" w:cs="Courier New"/>
+          <w:color w:val="18b2b2"/>
+          <w:sz w:val="20"/>
+          <w:highlight w:val="white"/>
+          <w:u w:val="single"/>
+        </w:rPr>
+        <w:t xml:space="preserve">/etc/ssh/sshd_config</w:t>
+      </w:r>
+      <w:r>
+        <w:rPr>
+          <w:rFonts w:ascii="Courier New" w:hAnsi="Courier New" w:eastAsia="Courier New" w:cs="Courier New"/>
+          <w:color w:val="18b2b2"/>
+          <w:sz w:val="20"/>
+          <w:szCs w:val="20"/>
+          <w:highlight w:val="none"/>
+        </w:rPr>
+      </w:r>
+    </w:p>
+    <w:p>
+      <w:pPr>
+        <w:pBdr>
+          <w:top w:val="none" w:color="000000" w:sz="4" w:space="0"/>
+          <w:left w:val="none" w:color="000000" w:sz="4" w:space="0"/>
+          <w:bottom w:val="none" w:color="000000" w:sz="4" w:space="0"/>
+          <w:right w:val="none" w:color="000000" w:sz="4" w:space="0"/>
+        </w:pBdr>
+        <w:spacing/>
+        <w:ind w:right="0" w:firstLine="0" w:left="0"/>
+        <w:rPr>
+          <w:rFonts w:ascii="Courier New" w:hAnsi="Courier New" w:eastAsia="Courier New" w:cs="Courier New"/>
+          <w:color w:val="18b2b2"/>
+          <w:sz w:val="20"/>
+          <w:szCs w:val="20"/>
+          <w:highlight w:val="none"/>
+        </w:rPr>
+      </w:pPr>
+      <w:r>
+        <w:rPr>
+          <w:rFonts w:ascii="Courier New" w:hAnsi="Courier New" w:eastAsia="Courier New" w:cs="Courier New"/>
+          <w:color w:val="000000" w:themeColor="text1"/>
+          <w:sz w:val="20"/>
+          <w:highlight w:val="none"/>
+          <w:u w:val="single"/>
+        </w:rPr>
+      </w:r>
+      <w:r>
+        <w:rPr>
+          <w:rFonts w:ascii="Courier New" w:hAnsi="Courier New" w:eastAsia="Courier New" w:cs="Courier New"/>
+          <w:color w:val="18b2b2"/>
+          <w:sz w:val="20"/>
+          <w:highlight w:val="none"/>
+          <w:u w:val="single"/>
+        </w:rPr>
+      </w:r>
+      <w:r>
+        <w:rPr>
+          <w:rFonts w:ascii="Courier New" w:hAnsi="Courier New" w:eastAsia="Courier New" w:cs="Courier New"/>
+          <w:color w:val="000000"/>
+          <w:sz w:val="20"/>
+          <w:highlight w:val="white"/>
+        </w:rPr>
+        <w:t xml:space="preserve">hydra </w:t>
+      </w:r>
+      <w:r>
+        <w:rPr>
+          <w:rFonts w:ascii="Courier New" w:hAnsi="Courier New" w:eastAsia="Courier New" w:cs="Courier New"/>
+          <w:color w:val="18b2b2"/>
+          <w:sz w:val="20"/>
+          <w:highlight w:val="white"/>
+        </w:rPr>
+        <w:t xml:space="preserve">-l</w:t>
+      </w:r>
+      <w:r>
+        <w:rPr>
+          <w:rFonts w:ascii="Courier New" w:hAnsi="Courier New" w:eastAsia="Courier New" w:cs="Courier New"/>
+          <w:color w:val="000000"/>
+          <w:sz w:val="20"/>
+          <w:highlight w:val="white"/>
+        </w:rPr>
+        <w:t xml:space="preserve"> </w:t>
+      </w:r>
+      <w:r>
+        <w:rPr>
+          <w:rFonts w:ascii="Courier New" w:hAnsi="Courier New" w:eastAsia="Courier New" w:cs="Courier New"/>
+          <w:color w:val="18b2b2"/>
+          <w:sz w:val="20"/>
+          <w:highlight w:val="white"/>
+        </w:rPr>
+        <w:t xml:space="preserve">root</w:t>
+      </w:r>
+      <w:r>
+        <w:rPr>
+          <w:rFonts w:ascii="Courier New" w:hAnsi="Courier New" w:eastAsia="Courier New" w:cs="Courier New"/>
+          <w:color w:val="000000"/>
+          <w:sz w:val="20"/>
+          <w:highlight w:val="white"/>
+        </w:rPr>
+        <w:t xml:space="preserve"> </w:t>
+      </w:r>
+      <w:r>
+        <w:rPr>
+          <w:rFonts w:ascii="Courier New" w:hAnsi="Courier New" w:eastAsia="Courier New" w:cs="Courier New"/>
+          <w:color w:val="18b2b2"/>
+          <w:sz w:val="20"/>
+          <w:highlight w:val="white"/>
+        </w:rPr>
+        <w:t xml:space="preserve">-P</w:t>
+      </w:r>
+      <w:r>
+        <w:rPr>
+          <w:rFonts w:ascii="Courier New" w:hAnsi="Courier New" w:eastAsia="Courier New" w:cs="Courier New"/>
+          <w:color w:val="000000"/>
+          <w:sz w:val="20"/>
+          <w:highlight w:val="white"/>
+        </w:rPr>
+        <w:t xml:space="preserve"> </w:t>
+      </w:r>
+      <w:r>
+        <w:rPr>
+          <w:rFonts w:ascii="Courier New" w:hAnsi="Courier New" w:eastAsia="Courier New" w:cs="Courier New"/>
+          <w:color w:val="18b2b2"/>
+          <w:sz w:val="20"/>
+          <w:highlight w:val="white"/>
+          <w:u w:val="single"/>
+        </w:rPr>
+        <w:t xml:space="preserve">/tmp/passwords.txt</w:t>
+      </w:r>
+      <w:r>
+        <w:rPr>
+          <w:rFonts w:ascii="Courier New" w:hAnsi="Courier New" w:eastAsia="Courier New" w:cs="Courier New"/>
+          <w:color w:val="000000"/>
+          <w:sz w:val="20"/>
+          <w:highlight w:val="white"/>
+        </w:rPr>
+        <w:t xml:space="preserve"> </w:t>
+      </w:r>
+      <w:r>
+        <w:rPr>
+          <w:rFonts w:ascii="Courier New" w:hAnsi="Courier New" w:eastAsia="Courier New" w:cs="Courier New"/>
+          <w:color w:val="18b2b2"/>
+          <w:sz w:val="20"/>
+          <w:highlight w:val="white"/>
+        </w:rPr>
+        <w:t xml:space="preserve">ssh://localhost</w:t>
+      </w:r>
+      <w:r>
+        <w:rPr>
+          <w:rFonts w:ascii="Courier New" w:hAnsi="Courier New" w:eastAsia="Courier New" w:cs="Courier New"/>
+          <w:color w:val="000000"/>
+          <w:sz w:val="20"/>
+          <w:highlight w:val="white"/>
+        </w:rPr>
+        <w:t xml:space="preserve"> </w:t>
+      </w:r>
+      <w:r>
+        <w:rPr>
+          <w:rFonts w:ascii="Courier New" w:hAnsi="Courier New" w:eastAsia="Courier New" w:cs="Courier New"/>
+          <w:color w:val="18b2b2"/>
+          <w:sz w:val="20"/>
+          <w:highlight w:val="white"/>
+        </w:rPr>
+        <w:t xml:space="preserve">-t</w:t>
+      </w:r>
+      <w:r>
+        <w:rPr>
+          <w:rFonts w:ascii="Courier New" w:hAnsi="Courier New" w:eastAsia="Courier New" w:cs="Courier New"/>
+          <w:color w:val="000000"/>
+          <w:sz w:val="20"/>
+          <w:highlight w:val="white"/>
+        </w:rPr>
+        <w:t xml:space="preserve"> </w:t>
+      </w:r>
+      <w:r>
+        <w:rPr>
+          <w:rFonts w:ascii="Courier New" w:hAnsi="Courier New" w:eastAsia="Courier New" w:cs="Courier New"/>
+          <w:color w:val="18b2b2"/>
+          <w:sz w:val="20"/>
+          <w:highlight w:val="white"/>
+        </w:rPr>
+        <w:t xml:space="preserve">4</w:t>
+      </w:r>
+      <w:r>
+        <w:rPr>
+          <w:rFonts w:ascii="Courier New" w:hAnsi="Courier New" w:eastAsia="Courier New" w:cs="Courier New"/>
+          <w:color w:val="000000" w:themeColor="text1"/>
+          <w:sz w:val="20"/>
+          <w:szCs w:val="20"/>
+          <w:highlight w:val="none"/>
+        </w:rPr>
+      </w:r>
+    </w:p>
+    <w:p>
+      <w:pPr>
+        <w:pBdr>
+          <w:top w:val="none" w:color="000000" w:sz="4" w:space="0"/>
+          <w:left w:val="none" w:color="000000" w:sz="4" w:space="0"/>
+          <w:bottom w:val="none" w:color="000000" w:sz="4" w:space="0"/>
+          <w:right w:val="none" w:color="000000" w:sz="4" w:space="0"/>
+        </w:pBdr>
+        <w:spacing/>
+        <w:ind w:right="0" w:firstLine="0" w:left="0"/>
+        <w:rPr>
+          <w:rFonts w:ascii="Courier New" w:hAnsi="Courier New" w:eastAsia="Courier New" w:cs="Courier New"/>
+          <w:color w:val="54ffff"/>
+          <w:sz w:val="20"/>
+          <w:szCs w:val="20"/>
+          <w:highlight w:val="none"/>
+        </w:rPr>
+      </w:pPr>
+      <w:r>
+        <w:rPr>
+          <w:rFonts w:ascii="Courier New" w:hAnsi="Courier New" w:eastAsia="Courier New" w:cs="Courier New"/>
+          <w:color w:val="000000" w:themeColor="text1"/>
+          <w:sz w:val="20"/>
+          <w:highlight w:val="none"/>
+        </w:rPr>
+      </w:r>
+      <w:r>
+        <w:rPr>
+          <w:rFonts w:ascii="Courier New" w:hAnsi="Courier New" w:eastAsia="Courier New" w:cs="Courier New"/>
+          <w:color w:val="000000" w:themeColor="text1"/>
+          <w:sz w:val="20"/>
+          <w:highlight w:val="none"/>
+          <w:lang w:val="sv-SE"/>
+        </w:rPr>
+        <w:t xml:space="preserve">Token:</w:t>
+        <w:br/>
+      </w:r>
+      <w:r>
+        <w:rPr>
+          <w:rFonts w:ascii="Courier New" w:hAnsi="Courier New" w:eastAsia="Courier New" w:cs="Courier New"/>
+          <w:color w:val="000000"/>
+          <w:sz w:val="20"/>
+          <w:highlight w:val="white"/>
+        </w:rPr>
+        <w:t xml:space="preserve">set </w:t>
+      </w:r>
+      <w:r>
+        <w:rPr>
+          <w:rFonts w:ascii="Courier New" w:hAnsi="Courier New" w:eastAsia="Courier New" w:cs="Courier New"/>
+          <w:color w:val="18b2b2"/>
+          <w:sz w:val="20"/>
+          <w:highlight w:val="white"/>
+        </w:rPr>
+        <w:t xml:space="preserve">TOKEN</w:t>
+      </w:r>
+      <w:r>
+        <w:rPr>
+          <w:rFonts w:ascii="Courier New" w:hAnsi="Courier New" w:eastAsia="Courier New" w:cs="Courier New"/>
+          <w:color w:val="000000"/>
+          <w:sz w:val="20"/>
+          <w:highlight w:val="white"/>
+        </w:rPr>
+        <w:t xml:space="preserve"> </w:t>
+      </w:r>
+      <w:r>
+        <w:rPr>
+          <w:rFonts w:ascii="Courier New" w:hAnsi="Courier New" w:eastAsia="Courier New" w:cs="Courier New"/>
+          <w:color w:val="54ffff"/>
+          <w:sz w:val="20"/>
+          <w:highlight w:val="white"/>
+        </w:rPr>
+        <w:t xml:space="preserve">(</w:t>
+      </w:r>
+      <w:r>
+        <w:rPr>
+          <w:rFonts w:ascii="Courier New" w:hAnsi="Courier New" w:eastAsia="Courier New" w:cs="Courier New"/>
+          <w:color w:val="000000"/>
+          <w:sz w:val="20"/>
+          <w:highlight w:val="white"/>
+        </w:rPr>
+        <w:t xml:space="preserve">curl </w:t>
+      </w:r>
+      <w:r>
+        <w:rPr>
+          <w:rFonts w:ascii="Courier New" w:hAnsi="Courier New" w:eastAsia="Courier New" w:cs="Courier New"/>
+          <w:color w:val="18b2b2"/>
+          <w:sz w:val="20"/>
+          <w:highlight w:val="white"/>
+        </w:rPr>
+        <w:t xml:space="preserve">-u</w:t>
+      </w:r>
+      <w:r>
+        <w:rPr>
+          <w:rFonts w:ascii="Courier New" w:hAnsi="Courier New" w:eastAsia="Courier New" w:cs="Courier New"/>
+          <w:color w:val="000000"/>
+          <w:sz w:val="20"/>
+          <w:highlight w:val="white"/>
+        </w:rPr>
+        <w:t xml:space="preserve"> </w:t>
+      </w:r>
+      <w:r>
+        <w:rPr>
+          <w:rFonts w:ascii="Courier New" w:hAnsi="Courier New" w:eastAsia="Courier New" w:cs="Courier New"/>
+          <w:color w:val="18b2b2"/>
+          <w:sz w:val="20"/>
+          <w:highlight w:val="white"/>
+        </w:rPr>
+        <w:t xml:space="preserve">wazuh-wui:</w:t>
+      </w:r>
+      <w:r>
+        <w:rPr>
+          <w:rFonts w:ascii="Courier New" w:hAnsi="Courier New" w:eastAsia="Courier New" w:cs="Courier New"/>
+          <w:color w:val="b26818"/>
+          <w:sz w:val="20"/>
+          <w:highlight w:val="white"/>
+        </w:rPr>
+        <w:t xml:space="preserve">"MyS3cr37P450r.*-"</w:t>
+      </w:r>
+      <w:r>
+        <w:rPr>
+          <w:rFonts w:ascii="Courier New" w:hAnsi="Courier New" w:eastAsia="Courier New" w:cs="Courier New"/>
+          <w:color w:val="000000"/>
+          <w:sz w:val="20"/>
+          <w:highlight w:val="white"/>
+        </w:rPr>
+        <w:t xml:space="preserve"> </w:t>
+      </w:r>
+      <w:r>
+        <w:rPr>
+          <w:rFonts w:ascii="Courier New" w:hAnsi="Courier New" w:eastAsia="Courier New" w:cs="Courier New"/>
+          <w:color w:val="18b2b2"/>
+          <w:sz w:val="20"/>
+          <w:highlight w:val="white"/>
+        </w:rPr>
+        <w:t xml:space="preserve">-k</w:t>
+      </w:r>
+      <w:r>
+        <w:rPr>
+          <w:rFonts w:ascii="Courier New" w:hAnsi="Courier New" w:eastAsia="Courier New" w:cs="Courier New"/>
+          <w:color w:val="000000"/>
+          <w:sz w:val="20"/>
+          <w:highlight w:val="white"/>
+        </w:rPr>
+        <w:t xml:space="preserve"> </w:t>
+      </w:r>
+      <w:r>
+        <w:rPr>
+          <w:rFonts w:ascii="Courier New" w:hAnsi="Courier New" w:eastAsia="Courier New" w:cs="Courier New"/>
+          <w:color w:val="18b2b2"/>
+          <w:sz w:val="20"/>
+          <w:highlight w:val="white"/>
+        </w:rPr>
+        <w:t xml:space="preserve">-X</w:t>
+      </w:r>
+      <w:r>
+        <w:rPr>
+          <w:rFonts w:ascii="Courier New" w:hAnsi="Courier New" w:eastAsia="Courier New" w:cs="Courier New"/>
+          <w:color w:val="000000"/>
+          <w:sz w:val="20"/>
+          <w:highlight w:val="white"/>
+        </w:rPr>
+        <w:t xml:space="preserve"> </w:t>
+      </w:r>
+      <w:r>
+        <w:rPr>
+          <w:rFonts w:ascii="Courier New" w:hAnsi="Courier New" w:eastAsia="Courier New" w:cs="Courier New"/>
+          <w:color w:val="18b2b2"/>
+          <w:sz w:val="20"/>
+          <w:highlight w:val="white"/>
+        </w:rPr>
+        <w:t xml:space="preserve">GET</w:t>
+      </w:r>
+      <w:r>
+        <w:rPr>
+          <w:rFonts w:ascii="Courier New" w:hAnsi="Courier New" w:eastAsia="Courier New" w:cs="Courier New"/>
+          <w:color w:val="000000"/>
+          <w:sz w:val="20"/>
+          <w:highlight w:val="white"/>
+        </w:rPr>
+        <w:t xml:space="preserve"> </w:t>
+      </w:r>
+      <w:r>
+        <w:rPr>
+          <w:rFonts w:ascii="Courier New" w:hAnsi="Courier New" w:eastAsia="Courier New" w:cs="Courier New"/>
+          <w:color w:val="b26818"/>
+          <w:sz w:val="20"/>
+          <w:highlight w:val="white"/>
+        </w:rPr>
+        <w:t xml:space="preserve">"https://localhost:55000/security/user/authenticate"</w:t>
+      </w:r>
+      <w:r>
+        <w:rPr>
+          <w:rFonts w:ascii="Courier New" w:hAnsi="Courier New" w:eastAsia="Courier New" w:cs="Courier New"/>
+          <w:color w:val="000000"/>
+          <w:sz w:val="20"/>
+          <w:highlight w:val="white"/>
+        </w:rPr>
+        <w:t xml:space="preserve"> </w:t>
+      </w:r>
+      <w:r>
+        <w:rPr>
+          <w:rFonts w:ascii="Courier New" w:hAnsi="Courier New" w:eastAsia="Courier New" w:cs="Courier New"/>
+          <w:color w:val="18b218"/>
+          <w:sz w:val="20"/>
+          <w:highlight w:val="white"/>
+        </w:rPr>
+        <w:t xml:space="preserve">|</w:t>
+      </w:r>
+      <w:r>
+        <w:rPr>
+          <w:rFonts w:ascii="Courier New" w:hAnsi="Courier New" w:eastAsia="Courier New" w:cs="Courier New"/>
+          <w:color w:val="000000"/>
+          <w:sz w:val="20"/>
+          <w:highlight w:val="white"/>
+        </w:rPr>
+        <w:t xml:space="preserve"> python3 </w:t>
+      </w:r>
+      <w:r>
+        <w:rPr>
+          <w:rFonts w:ascii="Courier New" w:hAnsi="Courier New" w:eastAsia="Courier New" w:cs="Courier New"/>
+          <w:color w:val="18b2b2"/>
+          <w:sz w:val="20"/>
+          <w:highlight w:val="white"/>
+        </w:rPr>
+        <w:t xml:space="preserve">-c</w:t>
+      </w:r>
+      <w:r>
+        <w:rPr>
+          <w:rFonts w:ascii="Courier New" w:hAnsi="Courier New" w:eastAsia="Courier New" w:cs="Courier New"/>
+          <w:color w:val="000000"/>
+          <w:sz w:val="20"/>
+          <w:highlight w:val="white"/>
+        </w:rPr>
+        <w:t xml:space="preserve"> </w:t>
+      </w:r>
+      <w:r>
+        <w:rPr>
+          <w:rFonts w:ascii="Courier New" w:hAnsi="Courier New" w:eastAsia="Courier New" w:cs="Courier New"/>
+          <w:color w:val="b26818"/>
+          <w:sz w:val="20"/>
+          <w:highlight w:val="white"/>
+        </w:rPr>
+        <w:t xml:space="preserve">"import sys, json; print(json.load(sys.stdin)['data']['token'</w:t>
+        <w:br/>
+        <w:t xml:space="preserve">])"</w:t>
+      </w:r>
+      <w:r>
+        <w:rPr>
+          <w:rFonts w:ascii="Courier New" w:hAnsi="Courier New" w:eastAsia="Courier New" w:cs="Courier New"/>
+          <w:color w:val="54ffff"/>
+          <w:sz w:val="20"/>
+          <w:highlight w:val="white"/>
+        </w:rPr>
+        <w:t xml:space="preserve">)</w:t>
+      </w:r>
+      <w:r>
+        <w:rPr>
+          <w:rFonts w:ascii="Courier New" w:hAnsi="Courier New" w:eastAsia="Courier New" w:cs="Courier New"/>
+          <w:color w:val="000000" w:themeColor="text1"/>
+          <w:sz w:val="20"/>
+          <w:szCs w:val="20"/>
+          <w:highlight w:val="none"/>
+        </w:rPr>
+      </w:r>
+    </w:p>
+    <w:p>
+      <w:pPr>
+        <w:pBdr>
+          <w:top w:val="none" w:color="000000" w:sz="4" w:space="0"/>
+          <w:left w:val="none" w:color="000000" w:sz="4" w:space="0"/>
+          <w:bottom w:val="none" w:color="000000" w:sz="4" w:space="0"/>
+          <w:right w:val="none" w:color="000000" w:sz="4" w:space="0"/>
+        </w:pBdr>
+        <w:spacing/>
+        <w:ind w:right="0" w:firstLine="0" w:left="0"/>
+        <w:rPr>
+          <w:rFonts w:ascii="Courier New" w:hAnsi="Courier New" w:eastAsia="Courier New" w:cs="Courier New"/>
+          <w:color w:val="18b2b2"/>
+          <w:sz w:val="20"/>
+          <w:szCs w:val="20"/>
+          <w:highlight w:val="none"/>
+          <w:u w:val="single"/>
+        </w:rPr>
+      </w:pPr>
+      <w:r>
+        <w:rPr>
+          <w:rFonts w:ascii="Courier New" w:hAnsi="Courier New" w:eastAsia="Courier New" w:cs="Courier New"/>
+          <w:color w:val="000000" w:themeColor="text1"/>
+          <w:sz w:val="20"/>
+          <w:highlight w:val="none"/>
+          <w:lang w:val="sv-SE"/>
+        </w:rPr>
+        <w:t xml:space="preserve">Python-skript (”AI”):</w:t>
+        <w:br/>
+      </w:r>
+      <w:r>
+        <w:rPr>
+          <w:rFonts w:ascii="Courier New" w:hAnsi="Courier New" w:eastAsia="Courier New" w:cs="Courier New"/>
+          <w:color w:val="54ffff"/>
+          <w:sz w:val="20"/>
+          <w:highlight w:val="none"/>
+        </w:rPr>
+      </w:r>
+      <w:r>
+        <w:rPr>
+          <w:rFonts w:ascii="Courier New" w:hAnsi="Courier New" w:eastAsia="Courier New" w:cs="Courier New"/>
+          <w:color w:val="000000"/>
+          <w:sz w:val="20"/>
+          <w:highlight w:val="white"/>
+        </w:rPr>
+        <w:t xml:space="preserve">python3 </w:t>
+      </w:r>
+      <w:r>
+        <w:rPr>
+          <w:rFonts w:ascii="Courier New" w:hAnsi="Courier New" w:eastAsia="Courier New" w:cs="Courier New"/>
+          <w:color w:val="18b2b2"/>
+          <w:sz w:val="20"/>
+          <w:highlight w:val="white"/>
+          <w:u w:val="single"/>
+        </w:rPr>
+        <w:t xml:space="preserve">anomaly_detector.py</w:t>
+      </w:r>
+      <w:r>
+        <w:rPr>
+          <w:rFonts w:ascii="Courier New" w:hAnsi="Courier New" w:eastAsia="Courier New" w:cs="Courier New"/>
+          <w:color w:val="000000"/>
+          <w:sz w:val="20"/>
+          <w:highlight w:val="white"/>
+        </w:rPr>
+        <w:t xml:space="preserve"> </w:t>
+      </w:r>
+      <w:r>
+        <w:rPr>
+          <w:rFonts w:ascii="Courier New" w:hAnsi="Courier New" w:eastAsia="Courier New" w:cs="Courier New"/>
+          <w:color w:val="18b2b2"/>
+          <w:sz w:val="20"/>
+          <w:highlight w:val="white"/>
+          <w:u w:val="single"/>
+        </w:rPr>
+        <w:t xml:space="preserve">baseline_alerts.json</w:t>
+      </w:r>
+      <w:r>
+        <w:rPr>
+          <w:rFonts w:ascii="Courier New" w:hAnsi="Courier New" w:eastAsia="Courier New" w:cs="Courier New"/>
+          <w:color w:val="000000" w:themeColor="text1"/>
+          <w:sz w:val="20"/>
+          <w:szCs w:val="20"/>
+          <w:highlight w:val="none"/>
+        </w:rPr>
+      </w:r>
+    </w:p>
+    <w:p>
+      <w:pPr>
+        <w:pBdr>
+          <w:top w:val="none" w:color="000000" w:sz="4" w:space="0"/>
+          <w:left w:val="none" w:color="000000" w:sz="4" w:space="0"/>
+          <w:bottom w:val="none" w:color="000000" w:sz="4" w:space="0"/>
+          <w:right w:val="none" w:color="000000" w:sz="4" w:space="0"/>
+        </w:pBdr>
+        <w:spacing/>
+        <w:ind w:right="0" w:firstLine="0" w:left="0"/>
+        <w:rPr>
+          <w:rFonts w:ascii="Courier New" w:hAnsi="Courier New" w:eastAsia="Courier New" w:cs="Courier New"/>
+          <w:color w:val="000000" w:themeColor="text1"/>
+          <w:sz w:val="20"/>
+          <w:szCs w:val="20"/>
+          <w:highlight w:val="none"/>
+          <w:u w:val="none"/>
+        </w:rPr>
+      </w:pPr>
+      <w:r>
+        <w:rPr>
+          <w:rFonts w:ascii="Courier New" w:hAnsi="Courier New" w:eastAsia="Courier New" w:cs="Courier New"/>
+          <w:color w:val="000000" w:themeColor="text1"/>
+          <w:sz w:val="20"/>
+          <w:highlight w:val="none"/>
+          <w:u w:val="none"/>
+          <w:lang w:val="sv-SE"/>
+        </w:rPr>
+        <w:t xml:space="preserve">Curl med tidsstämpel:</w:t>
+      </w:r>
+      <w:r>
+        <w:rPr>
+          <w:rFonts w:ascii="Courier New" w:hAnsi="Courier New" w:eastAsia="Courier New" w:cs="Courier New"/>
+          <w:color w:val="000000" w:themeColor="text1"/>
+          <w:sz w:val="20"/>
+          <w:szCs w:val="20"/>
+          <w:highlight w:val="none"/>
+          <w:u w:val="none"/>
+        </w:rPr>
+      </w:r>
+    </w:p>
+    <w:p>
+      <w:pPr>
+        <w:pBdr>
+          <w:top w:val="none" w:color="000000" w:sz="4" w:space="0"/>
+          <w:left w:val="none" w:color="000000" w:sz="4" w:space="0"/>
+          <w:bottom w:val="none" w:color="000000" w:sz="4" w:space="0"/>
+          <w:right w:val="none" w:color="000000" w:sz="4" w:space="0"/>
+        </w:pBdr>
+        <w:spacing/>
+        <w:ind w:right="0" w:firstLine="0" w:left="0"/>
+        <w:rPr>
+          <w:rFonts w:ascii="Courier New" w:hAnsi="Courier New" w:eastAsia="Courier New" w:cs="Courier New"/>
+          <w:color w:val="000000" w:themeColor="text1"/>
+          <w:sz w:val="20"/>
+          <w:szCs w:val="20"/>
+          <w:highlight w:val="none"/>
+          <w:u w:val="none"/>
+        </w:rPr>
+      </w:pPr>
+      <w:r>
+        <w:rPr>
+          <w:rFonts w:ascii="Courier New" w:hAnsi="Courier New" w:eastAsia="Courier New" w:cs="Courier New"/>
+          <w:color w:val="000000" w:themeColor="text1"/>
+          <w:sz w:val="20"/>
+          <w:highlight w:val="none"/>
+          <w:u w:val="none"/>
+          <w:lang w:val="sv-SE"/>
+        </w:rPr>
+      </w:r>
+      <w:r>
+        <w:rPr>
+          <w:rFonts w:ascii="Courier New" w:hAnsi="Courier New" w:eastAsia="Courier New" w:cs="Courier New"/>
+          <w:color w:val="000000" w:themeColor="text1"/>
+          <w:sz w:val="20"/>
+          <w:highlight w:val="none"/>
+          <w:u w:val="none"/>
+          <w:lang w:val="sv-SE"/>
+        </w:rPr>
+      </w:r>
+      <w:r>
+        <w:rPr>
+          <w:rFonts w:ascii="Courier New" w:hAnsi="Courier New" w:eastAsia="Courier New" w:cs="Courier New"/>
+          <w:color w:val="000000"/>
+          <w:sz w:val="20"/>
+          <w:highlight w:val="white"/>
+        </w:rPr>
+        <w:t xml:space="preserve">date </w:t>
+      </w:r>
+      <w:r>
+        <w:rPr>
+          <w:rFonts w:ascii="Courier New" w:hAnsi="Courier New" w:eastAsia="Courier New" w:cs="Courier New"/>
+          <w:color w:val="54ffff"/>
+          <w:sz w:val="20"/>
+          <w:highlight w:val="white"/>
+        </w:rPr>
+        <w:t xml:space="preserve">&amp;&amp;</w:t>
+      </w:r>
+      <w:r>
+        <w:rPr>
+          <w:rFonts w:ascii="Courier New" w:hAnsi="Courier New" w:eastAsia="Courier New" w:cs="Courier New"/>
+          <w:color w:val="000000"/>
+          <w:sz w:val="20"/>
+          <w:highlight w:val="white"/>
+        </w:rPr>
+        <w:t xml:space="preserve"> curl </w:t>
+      </w:r>
+      <w:r>
+        <w:rPr>
+          <w:rFonts w:ascii="Courier New" w:hAnsi="Courier New" w:eastAsia="Courier New" w:cs="Courier New"/>
+          <w:color w:val="18b2b2"/>
+          <w:sz w:val="20"/>
+          <w:highlight w:val="white"/>
+        </w:rPr>
+        <w:t xml:space="preserve">-k</w:t>
+      </w:r>
+      <w:r>
+        <w:rPr>
+          <w:rFonts w:ascii="Courier New" w:hAnsi="Courier New" w:eastAsia="Courier New" w:cs="Courier New"/>
+          <w:color w:val="000000"/>
+          <w:sz w:val="20"/>
+          <w:highlight w:val="white"/>
+        </w:rPr>
+        <w:t xml:space="preserve"> </w:t>
+      </w:r>
+      <w:r>
+        <w:rPr>
+          <w:rFonts w:ascii="Courier New" w:hAnsi="Courier New" w:eastAsia="Courier New" w:cs="Courier New"/>
+          <w:color w:val="18b2b2"/>
+          <w:sz w:val="20"/>
+          <w:highlight w:val="white"/>
+        </w:rPr>
+        <w:t xml:space="preserve">-X</w:t>
+      </w:r>
+      <w:r>
+        <w:rPr>
+          <w:rFonts w:ascii="Courier New" w:hAnsi="Courier New" w:eastAsia="Courier New" w:cs="Courier New"/>
+          <w:color w:val="000000"/>
+          <w:sz w:val="20"/>
+          <w:highlight w:val="white"/>
+        </w:rPr>
+        <w:t xml:space="preserve"> </w:t>
+      </w:r>
+      <w:r>
+        <w:rPr>
+          <w:rFonts w:ascii="Courier New" w:hAnsi="Courier New" w:eastAsia="Courier New" w:cs="Courier New"/>
+          <w:color w:val="18b2b2"/>
+          <w:sz w:val="20"/>
+          <w:highlight w:val="white"/>
+        </w:rPr>
+        <w:t xml:space="preserve">POST</w:t>
+      </w:r>
+      <w:r>
+        <w:rPr>
+          <w:rFonts w:ascii="Courier New" w:hAnsi="Courier New" w:eastAsia="Courier New" w:cs="Courier New"/>
+          <w:color w:val="000000"/>
+          <w:sz w:val="20"/>
+          <w:highlight w:val="white"/>
+        </w:rPr>
+        <w:t xml:space="preserve"> </w:t>
+      </w:r>
+      <w:r>
+        <w:rPr>
+          <w:rFonts w:ascii="Courier New" w:hAnsi="Courier New" w:eastAsia="Courier New" w:cs="Courier New"/>
+          <w:color w:val="b26818"/>
+          <w:sz w:val="20"/>
+          <w:highlight w:val="white"/>
+        </w:rPr>
+        <w:t xml:space="preserve">"https://localhost:55000/events"</w:t>
+      </w:r>
+      <w:r>
+        <w:rPr>
+          <w:rFonts w:ascii="Courier New" w:hAnsi="Courier New" w:eastAsia="Courier New" w:cs="Courier New"/>
+          <w:color w:val="000000"/>
+          <w:sz w:val="20"/>
+          <w:highlight w:val="white"/>
+        </w:rPr>
+        <w:t xml:space="preserve"> \ </w:t>
+        <w:br/>
+        <w:t xml:space="preserve">             </w:t>
+      </w:r>
+      <w:r>
+        <w:rPr>
+          <w:rFonts w:ascii="Courier New" w:hAnsi="Courier New" w:eastAsia="Courier New" w:cs="Courier New"/>
+          <w:color w:val="18b2b2"/>
+          <w:sz w:val="20"/>
+          <w:highlight w:val="white"/>
+        </w:rPr>
+        <w:t xml:space="preserve">-H</w:t>
+      </w:r>
+      <w:r>
+        <w:rPr>
+          <w:rFonts w:ascii="Courier New" w:hAnsi="Courier New" w:eastAsia="Courier New" w:cs="Courier New"/>
+          <w:color w:val="000000"/>
+          <w:sz w:val="20"/>
+          <w:highlight w:val="white"/>
+        </w:rPr>
+        <w:t xml:space="preserve"> </w:t>
+      </w:r>
+      <w:r>
+        <w:rPr>
+          <w:rFonts w:ascii="Courier New" w:hAnsi="Courier New" w:eastAsia="Courier New" w:cs="Courier New"/>
+          <w:color w:val="b26818"/>
+          <w:sz w:val="20"/>
+          <w:highlight w:val="white"/>
+        </w:rPr>
+        <w:t xml:space="preserve">"Authorization: Bearer </w:t>
+      </w:r>
+      <w:r>
+        <w:rPr>
+          <w:rFonts w:ascii="Courier New" w:hAnsi="Courier New" w:eastAsia="Courier New" w:cs="Courier New"/>
+          <w:color w:val="54ffff"/>
+          <w:sz w:val="20"/>
+          <w:highlight w:val="white"/>
+        </w:rPr>
+        <w:t xml:space="preserve">$TOKEN</w:t>
+      </w:r>
+      <w:r>
+        <w:rPr>
+          <w:rFonts w:ascii="Courier New" w:hAnsi="Courier New" w:eastAsia="Courier New" w:cs="Courier New"/>
+          <w:color w:val="b26818"/>
+          <w:sz w:val="20"/>
+          <w:highlight w:val="white"/>
+        </w:rPr>
+        <w:t xml:space="preserve">"</w:t>
+      </w:r>
+      <w:r>
+        <w:rPr>
+          <w:rFonts w:ascii="Courier New" w:hAnsi="Courier New" w:eastAsia="Courier New" w:cs="Courier New"/>
+          <w:color w:val="000000"/>
+          <w:sz w:val="20"/>
+          <w:highlight w:val="white"/>
+        </w:rPr>
+        <w:t xml:space="preserve"> \ </w:t>
+        <w:br/>
+        <w:t xml:space="preserve">             </w:t>
+      </w:r>
+      <w:r>
+        <w:rPr>
+          <w:rFonts w:ascii="Courier New" w:hAnsi="Courier New" w:eastAsia="Courier New" w:cs="Courier New"/>
+          <w:color w:val="18b2b2"/>
+          <w:sz w:val="20"/>
+          <w:highlight w:val="white"/>
+        </w:rPr>
+        <w:t xml:space="preserve">-H</w:t>
+      </w:r>
+      <w:r>
+        <w:rPr>
+          <w:rFonts w:ascii="Courier New" w:hAnsi="Courier New" w:eastAsia="Courier New" w:cs="Courier New"/>
+          <w:color w:val="000000"/>
+          <w:sz w:val="20"/>
+          <w:highlight w:val="white"/>
+        </w:rPr>
+        <w:t xml:space="preserve"> </w:t>
+      </w:r>
+      <w:r>
+        <w:rPr>
+          <w:rFonts w:ascii="Courier New" w:hAnsi="Courier New" w:eastAsia="Courier New" w:cs="Courier New"/>
+          <w:color w:val="b26818"/>
+          <w:sz w:val="20"/>
+          <w:highlight w:val="white"/>
+        </w:rPr>
+        <w:t xml:space="preserve">"Content-Type: application/json"</w:t>
+      </w:r>
+      <w:r>
+        <w:rPr>
+          <w:rFonts w:ascii="Courier New" w:hAnsi="Courier New" w:eastAsia="Courier New" w:cs="Courier New"/>
+          <w:color w:val="000000"/>
+          <w:sz w:val="20"/>
+          <w:highlight w:val="white"/>
+        </w:rPr>
+        <w:t xml:space="preserve"> \ </w:t>
+        <w:br/>
+        <w:t xml:space="preserve">             </w:t>
+      </w:r>
+      <w:r>
+        <w:rPr>
+          <w:rFonts w:ascii="Courier New" w:hAnsi="Courier New" w:eastAsia="Courier New" w:cs="Courier New"/>
+          <w:color w:val="18b2b2"/>
+          <w:sz w:val="20"/>
+          <w:highlight w:val="white"/>
+        </w:rPr>
+        <w:t xml:space="preserve">-d</w:t>
+      </w:r>
+      <w:r>
+        <w:rPr>
+          <w:rFonts w:ascii="Courier New" w:hAnsi="Courier New" w:eastAsia="Courier New" w:cs="Courier New"/>
+          <w:color w:val="000000"/>
+          <w:sz w:val="20"/>
+          <w:highlight w:val="white"/>
+        </w:rPr>
+        <w:t xml:space="preserve"> </w:t>
+      </w:r>
+      <w:r>
+        <w:rPr>
+          <w:rFonts w:ascii="Courier New" w:hAnsi="Courier New" w:eastAsia="Courier New" w:cs="Courier New"/>
+          <w:color w:val="b26818"/>
+          <w:sz w:val="20"/>
+          <w:highlight w:val="white"/>
+        </w:rPr>
+        <w:t xml:space="preserve">'{</w:t>
+      </w:r>
+      <w:r>
+        <w:rPr>
+          <w:rFonts w:ascii="Courier New" w:hAnsi="Courier New" w:eastAsia="Courier New" w:cs="Courier New"/>
+          <w:color w:val="000000"/>
+          <w:sz w:val="20"/>
+          <w:highlight w:val="white"/>
+        </w:rPr>
+        <w:t xml:space="preserve"> </w:t>
+        <w:br/>
+        <w:t xml:space="preserve">       </w:t>
+      </w:r>
+      <w:r>
+        <w:rPr>
+          <w:rFonts w:ascii="Courier New" w:hAnsi="Courier New" w:eastAsia="Courier New" w:cs="Courier New"/>
+          <w:color w:val="b26818"/>
+          <w:sz w:val="20"/>
+          <w:highlight w:val="white"/>
+        </w:rPr>
+        <w:t xml:space="preserve">    "events": [</w:t>
+      </w:r>
+      <w:r>
+        <w:rPr>
+          <w:rFonts w:ascii="Courier New" w:hAnsi="Courier New" w:eastAsia="Courier New" w:cs="Courier New"/>
+          <w:color w:val="000000"/>
+          <w:sz w:val="20"/>
+          <w:highlight w:val="white"/>
+        </w:rPr>
+        <w:t xml:space="preserve"> </w:t>
+        <w:br/>
+        <w:t xml:space="preserve">       </w:t>
+      </w:r>
+      <w:r>
+        <w:rPr>
+          <w:rFonts w:ascii="Courier New" w:hAnsi="Courier New" w:eastAsia="Courier New" w:cs="Courier New"/>
+          <w:color w:val="b26818"/>
+          <w:sz w:val="20"/>
+          <w:highlight w:val="white"/>
+        </w:rPr>
+        <w:t xml:space="preserve">      "{\"ai_detector\": \"true\", \"severity\": \"critical\", \"description\": \"AI-anomalidetektering: Aggressiv brute force bekräftad via Isolation Forest\"}"</w:t>
+      </w:r>
+      <w:r>
+        <w:rPr>
+          <w:rFonts w:ascii="Courier New" w:hAnsi="Courier New" w:eastAsia="Courier New" w:cs="Courier New"/>
+          <w:color w:val="000000"/>
+          <w:sz w:val="20"/>
+          <w:highlight w:val="white"/>
+        </w:rPr>
+        <w:t xml:space="preserve"> </w:t>
+        <w:br/>
+        <w:t xml:space="preserve">       </w:t>
+      </w:r>
+      <w:r>
+        <w:rPr>
+          <w:rFonts w:ascii="Courier New" w:hAnsi="Courier New" w:eastAsia="Courier New" w:cs="Courier New"/>
+          <w:color w:val="b26818"/>
+          <w:sz w:val="20"/>
+          <w:highlight w:val="white"/>
+        </w:rPr>
+        <w:t xml:space="preserve">    ]</w:t>
+      </w:r>
+      <w:r>
+        <w:rPr>
+          <w:rFonts w:ascii="Courier New" w:hAnsi="Courier New" w:eastAsia="Courier New" w:cs="Courier New"/>
+          <w:color w:val="000000"/>
+          <w:sz w:val="20"/>
+          <w:highlight w:val="white"/>
+        </w:rPr>
+        <w:t xml:space="preserve"> </w:t>
+        <w:br/>
+        <w:t xml:space="preserve">       </w:t>
+      </w:r>
+      <w:r>
+        <w:rPr>
+          <w:rFonts w:ascii="Courier New" w:hAnsi="Courier New" w:eastAsia="Courier New" w:cs="Courier New"/>
+          <w:color w:val="b26818"/>
+          <w:sz w:val="20"/>
+          <w:highlight w:val="white"/>
+        </w:rPr>
+        <w:t xml:space="preserve">  }'</w:t>
+        <w:br/>
+      </w:r>
+      <w:r>
+        <w:rPr>
+          <w:rFonts w:ascii="Courier New" w:hAnsi="Courier New" w:eastAsia="Courier New" w:cs="Courier New"/>
+          <w:color w:val="000000"/>
+          <w:sz w:val="20"/>
+          <w:highlight w:val="white"/>
+        </w:rPr>
+        <w:t xml:space="preserve"> </w:t>
+      </w:r>
+      <w:r>
+        <w:rPr>
+          <w:rFonts w:ascii="Courier New" w:hAnsi="Courier New" w:eastAsia="Courier New" w:cs="Courier New"/>
+          <w:color w:val="000000" w:themeColor="text1"/>
+          <w:sz w:val="20"/>
+          <w:highlight w:val="none"/>
+          <w:u w:val="none"/>
+          <w:lang w:val="sv-SE"/>
+        </w:rPr>
+      </w:r>
+      <w:r>
+        <w:rPr>
+          <w:rFonts w:ascii="Courier New" w:hAnsi="Courier New" w:eastAsia="Courier New" w:cs="Courier New"/>
+          <w:color w:val="000000" w:themeColor="text1"/>
+          <w:sz w:val="20"/>
+          <w:highlight w:val="none"/>
+          <w:u w:val="none"/>
+          <w:lang w:val="sv-SE"/>
         </w:rPr>
       </w:r>
     </w:p>

</xml_diff>